<commit_message>
added reference internal files and report cahnges
</commit_message>
<xml_diff>
--- a/DOCUMENTS/Assessment_1_report.docx
+++ b/DOCUMENTS/Assessment_1_report.docx
@@ -1,6 +1,6 @@
 
 <file path=word/document.xml><?xml version="1.0" encoding="utf-8"?>
-<w:document xmlns:wpc="http://schemas.microsoft.com/office/word/2010/wordprocessingCanvas" xmlns:cx="http://schemas.microsoft.com/office/drawing/2014/chartex" xmlns:cx1="http://schemas.microsoft.com/office/drawing/2015/9/8/chartex" xmlns:cx2="http://schemas.microsoft.com/office/drawing/2015/10/21/chartex" xmlns:cx3="http://schemas.microsoft.com/office/drawing/2016/5/9/chartex" xmlns:cx4="http://schemas.microsoft.com/office/drawing/2016/5/10/chartex" xmlns:cx5="http://schemas.microsoft.com/office/drawing/2016/5/11/chartex" xmlns:cx6="http://schemas.microsoft.com/office/drawing/2016/5/12/chartex" xmlns:cx7="http://schemas.microsoft.com/office/drawing/2016/5/13/chartex" xmlns:cx8="http://schemas.microsoft.com/office/drawing/2016/5/14/chartex" xmlns:mc="http://schemas.openxmlformats.org/markup-compatibility/2006" xmlns:aink="http://schemas.microsoft.com/office/drawing/2016/ink" xmlns:am3d="http://schemas.microsoft.com/office/drawing/2017/model3d" xmlns:o="urn:schemas-microsoft-com:office:office" xmlns:oel="http://schemas.microsoft.com/office/2019/extlst" xmlns:r="http://schemas.openxmlformats.org/officeDocument/2006/relationships" xmlns:m="http://schemas.openxmlformats.org/officeDocument/2006/math" xmlns:v="urn:schemas-microsoft-com:vml" xmlns:wp14="http://schemas.microsoft.com/office/word/2010/wordprocessingDrawing" xmlns:wp="http://schemas.openxmlformats.org/drawingml/2006/wordprocessingDrawing" xmlns:w10="urn:schemas-microsoft-com:office:word" xmlns:w="http://schemas.openxmlformats.org/wordprocessingml/2006/main" xmlns:w14="http://schemas.microsoft.com/office/word/2010/wordml" xmlns:w15="http://schemas.microsoft.com/office/word/2012/wordml" xmlns:w16cex="http://schemas.microsoft.com/office/word/2018/wordml/cex" xmlns:w16cid="http://schemas.microsoft.com/office/word/2016/wordml/cid" xmlns:w16="http://schemas.microsoft.com/office/word/2018/wordml" xmlns:w16du="http://schemas.microsoft.com/office/word/2023/wordml/word16du" xmlns:w16sdtdh="http://schemas.microsoft.com/office/word/2020/wordml/sdtdatahash" xmlns:w16sdtfl="http://schemas.microsoft.com/office/word/2024/wordml/sdtformatlock" xmlns:w16se="http://schemas.microsoft.com/office/word/2015/wordml/symex" xmlns:wpg="http://schemas.microsoft.com/office/word/2010/wordprocessingGroup" xmlns:wpi="http://schemas.microsoft.com/office/word/2010/wordprocessingInk" xmlns:wne="http://schemas.microsoft.com/office/word/2006/wordml" xmlns:wps="http://schemas.microsoft.com/office/word/2010/wordprocessingShape" mc:Ignorable="w14 w15 w16se w16cid w16 w16cex w16sdtdh w16sdtfl w16du wp14">
+<w:document xmlns:wpc="http://schemas.microsoft.com/office/word/2010/wordprocessingCanvas" xmlns:cx="http://schemas.microsoft.com/office/drawing/2014/chartex" xmlns:cx1="http://schemas.microsoft.com/office/drawing/2015/9/8/chartex" xmlns:cx2="http://schemas.microsoft.com/office/drawing/2015/10/21/chartex" xmlns:cx3="http://schemas.microsoft.com/office/drawing/2016/5/9/chartex" xmlns:cx4="http://schemas.microsoft.com/office/drawing/2016/5/10/chartex" xmlns:cx5="http://schemas.microsoft.com/office/drawing/2016/5/11/chartex" xmlns:cx6="http://schemas.microsoft.com/office/drawing/2016/5/12/chartex" xmlns:cx7="http://schemas.microsoft.com/office/drawing/2016/5/13/chartex" xmlns:cx8="http://schemas.microsoft.com/office/drawing/2016/5/14/chartex" xmlns:mc="http://schemas.openxmlformats.org/markup-compatibility/2006" xmlns:m="http://schemas.openxmlformats.org/officeDocument/2006/math" xmlns:aink="http://schemas.microsoft.com/office/drawing/2016/ink" xmlns:am3d="http://schemas.microsoft.com/office/drawing/2017/model3d" xmlns:oel="http://schemas.microsoft.com/office/2019/extlst" xmlns:r="http://schemas.openxmlformats.org/officeDocument/2006/relationships" xmlns:wp14="http://schemas.microsoft.com/office/word/2010/wordprocessingDrawing" xmlns:wp="http://schemas.openxmlformats.org/drawingml/2006/wordprocessingDrawing" xmlns:wpg="http://schemas.microsoft.com/office/word/2010/wordprocessingGroup" xmlns:wpi="http://schemas.microsoft.com/office/word/2010/wordprocessingInk" xmlns:wps="http://schemas.microsoft.com/office/word/2010/wordprocessingShape" xmlns:o="urn:schemas-microsoft-com:office:office" xmlns:v="urn:schemas-microsoft-com:vml" xmlns:w10="urn:schemas-microsoft-com:office:word" xmlns:w="http://schemas.openxmlformats.org/wordprocessingml/2006/main" xmlns:w14="http://schemas.microsoft.com/office/word/2010/wordml" xmlns:w15="http://schemas.microsoft.com/office/word/2012/wordml" xmlns:w16cex="http://schemas.microsoft.com/office/word/2018/wordml/cex" xmlns:w16cid="http://schemas.microsoft.com/office/word/2016/wordml/cid" xmlns:w16="http://schemas.microsoft.com/office/word/2018/wordml" xmlns:w16sdtdh="http://schemas.microsoft.com/office/word/2020/wordml/sdtdatahash" xmlns:w16sdtfl="http://schemas.microsoft.com/office/word/2024/wordml/sdtformatlock" xmlns:w16se="http://schemas.microsoft.com/office/word/2015/wordml/symex" xmlns:w16du="http://schemas.microsoft.com/office/word/2023/wordml/word16du" xmlns:wne="http://schemas.microsoft.com/office/word/2006/wordml" mc:Ignorable="w14 w15 w16se w16cid w16 w16cex w16sdtdh w16sdtfl w16du wp14">
   <w:body>
     <w:p>
       <w:pPr>
@@ -987,6 +987,17 @@
                 <w14:ligatures w14:val="none"/>
               </w:rPr>
             </w:pPr>
+            <w:r>
+              <w:rPr>
+                <w:rFonts w:ascii="Segoe UI" w:eastAsia="Times New Roman" w:hAnsi="Segoe UI" w:cs="Segoe UI"/>
+                <w:kern w:val="0"/>
+                <w:sz w:val="18"/>
+                <w:szCs w:val="18"/>
+                <w:lang w:val="en-NZ" w:eastAsia="en-NZ"/>
+                <w14:ligatures w14:val="none"/>
+              </w:rPr>
+              <w:t>Rikesh Aryal</w:t>
+            </w:r>
           </w:p>
         </w:tc>
         <w:tc>
@@ -1010,6 +1021,15 @@
                 <w14:ligatures w14:val="none"/>
               </w:rPr>
             </w:pPr>
+            <w:r>
+              <w:rPr>
+                <w:rFonts w:ascii="Calibri" w:eastAsia="Times New Roman" w:hAnsi="Calibri" w:cs="Calibri"/>
+                <w:kern w:val="0"/>
+                <w:lang w:eastAsia="en-NZ"/>
+                <w14:ligatures w14:val="none"/>
+              </w:rPr>
+              <w:t>CIHE251435</w:t>
+            </w:r>
           </w:p>
         </w:tc>
         <w:tc>
@@ -1035,6 +1055,17 @@
                 <w14:ligatures w14:val="none"/>
               </w:rPr>
             </w:pPr>
+            <w:r>
+              <w:rPr>
+                <w:rFonts w:ascii="Segoe UI" w:eastAsia="Times New Roman" w:hAnsi="Segoe UI" w:cs="Segoe UI"/>
+                <w:kern w:val="0"/>
+                <w:sz w:val="18"/>
+                <w:szCs w:val="18"/>
+                <w:lang w:val="en-NZ" w:eastAsia="en-NZ"/>
+                <w14:ligatures w14:val="none"/>
+              </w:rPr>
+              <w:t>20%</w:t>
+            </w:r>
           </w:p>
         </w:tc>
         <w:tc>
@@ -1047,6 +1078,35 @@
               <w:right w:val="single" w:sz="6" w:space="0" w:color="000000" w:themeColor="text1"/>
             </w:tcBorders>
           </w:tcPr>
+          <w:p>
+            <w:pPr>
+              <w:spacing w:after="0" w:line="240" w:lineRule="auto"/>
+              <w:textAlignment w:val="baseline"/>
+              <w:rPr>
+                <w:rFonts w:ascii="Segoe UI" w:eastAsia="Times New Roman" w:hAnsi="Segoe UI" w:cs="Segoe UI"/>
+                <w:b/>
+                <w:bCs/>
+                <w:kern w:val="0"/>
+                <w:sz w:val="18"/>
+                <w:szCs w:val="18"/>
+                <w:lang w:val="en-GB" w:eastAsia="en-NZ"/>
+                <w14:ligatures w14:val="none"/>
+              </w:rPr>
+            </w:pPr>
+            <w:r>
+              <w:rPr>
+                <w:rFonts w:ascii="Segoe UI" w:eastAsia="Times New Roman" w:hAnsi="Segoe UI" w:cs="Segoe UI"/>
+                <w:b/>
+                <w:bCs/>
+                <w:kern w:val="0"/>
+                <w:sz w:val="18"/>
+                <w:szCs w:val="18"/>
+                <w:lang w:val="en-GB" w:eastAsia="en-NZ"/>
+                <w14:ligatures w14:val="none"/>
+              </w:rPr>
+              <w:t>Software Requirements Specification</w:t>
+            </w:r>
+          </w:p>
           <w:p>
             <w:pPr>
               <w:spacing w:after="0" w:line="240" w:lineRule="auto"/>
@@ -1962,6 +2022,7 @@
         <w:pStyle w:val="Heading1"/>
       </w:pPr>
       <w:r>
+        <w:lastRenderedPageBreak/>
         <w:t>3.Requirements Elicitation Report</w:t>
       </w:r>
     </w:p>
@@ -4395,21 +4456,7 @@
               <w:rPr>
                 <w:lang w:val="en-US"/>
               </w:rPr>
-              <w:t xml:space="preserve">Clinical synthetic </w:t>
-            </w:r>
-            <w:proofErr w:type="gramStart"/>
-            <w:r>
-              <w:rPr>
-                <w:lang w:val="en-US"/>
-              </w:rPr>
-              <w:t>dataset</w:t>
-            </w:r>
-            <w:proofErr w:type="gramEnd"/>
-            <w:r>
-              <w:rPr>
-                <w:lang w:val="en-US"/>
-              </w:rPr>
-              <w:t xml:space="preserve"> produced using SNOMED CT-AU codes.</w:t>
+              <w:t>Clinical synthetic dataset produced using SNOMED CT-AU codes.</w:t>
             </w:r>
           </w:p>
         </w:tc>
@@ -5739,21 +5786,7 @@
               <w:rPr>
                 <w:lang w:val="en-US"/>
               </w:rPr>
-              <w:t>Failed test entries include a specific failure reason</w:t>
-            </w:r>
-            <w:proofErr w:type="gramStart"/>
-            <w:r>
-              <w:rPr>
-                <w:lang w:val="en-US"/>
-              </w:rPr>
-              <w:t>/error</w:t>
-            </w:r>
-            <w:proofErr w:type="gramEnd"/>
-            <w:r>
-              <w:rPr>
-                <w:lang w:val="en-US"/>
-              </w:rPr>
-              <w:t xml:space="preserve"> message.</w:t>
+              <w:t>Failed test entries include a specific failure reason/error message.</w:t>
             </w:r>
           </w:p>
         </w:tc>
@@ -6793,14 +6826,14 @@
               <w:rPr>
                 <w:rFonts w:ascii="Times New Roman" w:hAnsi="Times New Roman" w:cs="Times New Roman"/>
               </w:rPr>
-              <w:t xml:space="preserve">The test harness shall allow the project users to execute tests easily </w:t>
+              <w:t xml:space="preserve">The test harness shall allow the project users to execute tests easily and </w:t>
             </w:r>
             <w:r>
               <w:rPr>
                 <w:rFonts w:ascii="Times New Roman" w:hAnsi="Times New Roman" w:cs="Times New Roman"/>
               </w:rPr>
               <w:lastRenderedPageBreak/>
-              <w:t>and understand results without technical knowledge.</w:t>
+              <w:t>understand results without technical knowledge.</w:t>
             </w:r>
           </w:p>
         </w:tc>
@@ -7699,14 +7732,7 @@
               <w:rPr>
                 <w:rFonts w:ascii="Times New Roman" w:hAnsi="Times New Roman" w:cs="Times New Roman"/>
               </w:rPr>
-              <w:t xml:space="preserve">Halo connect documentation to be reviewed and confirm the integration supported resources or </w:t>
-            </w:r>
-            <w:r>
-              <w:rPr>
-                <w:rFonts w:ascii="Times New Roman" w:hAnsi="Times New Roman" w:cs="Times New Roman"/>
-              </w:rPr>
-              <w:lastRenderedPageBreak/>
-              <w:t>endpoints or profiles.</w:t>
+              <w:t>Halo connect documentation to be reviewed and confirm the integration supported resources or endpoints or profiles.</w:t>
             </w:r>
           </w:p>
         </w:tc>
@@ -7724,7 +7750,6 @@
               <w:rPr>
                 <w:rFonts w:ascii="Times New Roman" w:hAnsi="Times New Roman" w:cs="Times New Roman"/>
               </w:rPr>
-              <w:lastRenderedPageBreak/>
               <w:t>Rikesh</w:t>
             </w:r>
           </w:p>
@@ -7745,6 +7770,7 @@
               <w:rPr>
                 <w:rFonts w:ascii="Times New Roman" w:hAnsi="Times New Roman" w:cs="Times New Roman"/>
               </w:rPr>
+              <w:lastRenderedPageBreak/>
               <w:t>AC4</w:t>
             </w:r>
           </w:p>
@@ -8469,14 +8495,7 @@
               <w:rPr>
                 <w:rFonts w:ascii="Times New Roman" w:hAnsi="Times New Roman" w:cs="Times New Roman"/>
               </w:rPr>
-              <w:t xml:space="preserve">To ensure the synthetic dataset and mapping are compatible with the real </w:t>
-            </w:r>
-            <w:r>
-              <w:rPr>
-                <w:rFonts w:ascii="Times New Roman" w:hAnsi="Times New Roman" w:cs="Times New Roman"/>
-              </w:rPr>
-              <w:lastRenderedPageBreak/>
-              <w:t>FHIR expectations of the target systems.</w:t>
+              <w:t>To ensure the synthetic dataset and mapping are compatible with the real FHIR expectations of the target systems.</w:t>
             </w:r>
           </w:p>
         </w:tc>
@@ -8494,7 +8513,6 @@
               <w:rPr>
                 <w:rFonts w:ascii="Times New Roman" w:hAnsi="Times New Roman" w:cs="Times New Roman"/>
               </w:rPr>
-              <w:lastRenderedPageBreak/>
               <w:t>Mentor</w:t>
             </w:r>
           </w:p>
@@ -8551,6 +8569,7 @@
               <w:rPr>
                 <w:rFonts w:ascii="Times New Roman" w:hAnsi="Times New Roman" w:cs="Times New Roman"/>
               </w:rPr>
+              <w:lastRenderedPageBreak/>
               <w:t>Q3</w:t>
             </w:r>
           </w:p>
@@ -9373,7 +9392,6 @@
               <w:rPr>
                 <w:rFonts w:ascii="Times New Roman" w:hAnsi="Times New Roman" w:cs="Times New Roman"/>
               </w:rPr>
-              <w:lastRenderedPageBreak/>
               <w:t>BR1</w:t>
             </w:r>
           </w:p>
@@ -9592,7 +9610,14 @@
               <w:rPr>
                 <w:rFonts w:ascii="Times New Roman" w:hAnsi="Times New Roman" w:cs="Times New Roman"/>
               </w:rPr>
-              <w:t>Reviewing FHIR interface configurations against Halo Connect to validate responses against FHIR</w:t>
+              <w:t xml:space="preserve">Reviewing FHIR interface </w:t>
+            </w:r>
+            <w:r>
+              <w:rPr>
+                <w:rFonts w:ascii="Times New Roman" w:hAnsi="Times New Roman" w:cs="Times New Roman"/>
+              </w:rPr>
+              <w:lastRenderedPageBreak/>
+              <w:t>configurations against Halo Connect to validate responses against FHIR</w:t>
             </w:r>
           </w:p>
         </w:tc>
@@ -9610,6 +9635,7 @@
               <w:rPr>
                 <w:rFonts w:ascii="Times New Roman" w:hAnsi="Times New Roman" w:cs="Times New Roman"/>
               </w:rPr>
+              <w:lastRenderedPageBreak/>
               <w:t>To be confirmed</w:t>
             </w:r>
           </w:p>
@@ -10146,6 +10172,2294 @@
     <w:p>
       <w:pPr>
         <w:pStyle w:val="Heading2"/>
+        <w:rPr>
+          <w:rStyle w:val="Heading1Char"/>
+        </w:rPr>
+      </w:pPr>
+    </w:p>
+    <w:p>
+      <w:pPr>
+        <w:rPr>
+          <w:rStyle w:val="Heading1Char"/>
+        </w:rPr>
+      </w:pPr>
+      <w:r>
+        <w:rPr>
+          <w:rStyle w:val="Heading1Char"/>
+        </w:rPr>
+        <w:br w:type="page"/>
+      </w:r>
+    </w:p>
+    <w:p>
+      <w:pPr>
+        <w:pStyle w:val="Heading1"/>
+      </w:pPr>
+      <w:r>
+        <w:lastRenderedPageBreak/>
+        <w:t xml:space="preserve">4. </w:t>
+      </w:r>
+      <w:r>
+        <w:t>Software Requirements Specification</w:t>
+      </w:r>
+    </w:p>
+    <w:p>
+      <w:pPr>
+        <w:pStyle w:val="z-BottomofForm"/>
+      </w:pPr>
+      <w:r>
+        <w:t>Bottom of Form</w:t>
+      </w:r>
+    </w:p>
+    <w:p>
+      <w:pPr>
+        <w:rPr>
+          <w:rFonts w:ascii="Times New Roman" w:hAnsi="Times New Roman" w:cs="Times New Roman"/>
+          <w:sz w:val="24"/>
+          <w:szCs w:val="24"/>
+        </w:rPr>
+      </w:pPr>
+    </w:p>
+    <w:p>
+      <w:pPr>
+        <w:pStyle w:val="Heading2"/>
+      </w:pPr>
+      <w:r>
+        <w:t>4.1. Introduction</w:t>
+      </w:r>
+    </w:p>
+    <w:p>
+      <w:pPr>
+        <w:pStyle w:val="Heading3"/>
+      </w:pPr>
+      <w:r>
+        <w:t>4.1.1. Purpose</w:t>
+      </w:r>
+    </w:p>
+    <w:p>
+      <w:r>
+        <w:t xml:space="preserve">This Software Requirements Specification (SRS) provides the requirements and </w:t>
+      </w:r>
+      <w:proofErr w:type="spellStart"/>
+      <w:r>
+        <w:t>behavior</w:t>
+      </w:r>
+      <w:proofErr w:type="spellEnd"/>
+      <w:r>
+        <w:t xml:space="preserve"> specifications for the Synthetic FHIR R4 Sandbox &amp; Test Harness system (FAZ Australia. (n.d.)). This system is designed to act as a sandbox environment for testing the interoperability of health care data exchanges and integrations using synthetic clinical data.</w:t>
+      </w:r>
+    </w:p>
+    <w:p>
+      <w:r>
+        <w:t>Functional and non-functional requirements along with interactions, scope, and acceptance criteria have been specified in this Software Requirements Specification (SRS).</w:t>
+      </w:r>
+    </w:p>
+    <w:p>
+      <w:pPr>
+        <w:pStyle w:val="Heading3"/>
+      </w:pPr>
+      <w:r>
+        <w:t>4.1.2. Scope</w:t>
+      </w:r>
+    </w:p>
+    <w:p>
+      <w:r>
+        <w:t>T</w:t>
+      </w:r>
+      <w:r>
+        <w:t>he scope of the project will be based on a synthetic healthcare test environment that will be able to create interactions between different clinical systems through FHIR-based synthetic data</w:t>
+      </w:r>
+      <w:r>
+        <w:t xml:space="preserve">. </w:t>
+      </w:r>
+    </w:p>
+    <w:p>
+      <w:pPr>
+        <w:rPr>
+          <w:b/>
+          <w:bCs/>
+        </w:rPr>
+      </w:pPr>
+      <w:r>
+        <w:rPr>
+          <w:b/>
+          <w:bCs/>
+        </w:rPr>
+        <w:t>In-scope</w:t>
+      </w:r>
+    </w:p>
+    <w:p>
+      <w:pPr>
+        <w:pStyle w:val="ListParagraph"/>
+        <w:numPr>
+          <w:ilvl w:val="0"/>
+          <w:numId w:val="3"/>
+        </w:numPr>
+      </w:pPr>
+      <w:r>
+        <w:t>Synthetic loading of patient and clinical records into the test environment.</w:t>
+      </w:r>
+    </w:p>
+    <w:p>
+      <w:pPr>
+        <w:pStyle w:val="ListParagraph"/>
+        <w:numPr>
+          <w:ilvl w:val="0"/>
+          <w:numId w:val="3"/>
+        </w:numPr>
+      </w:pPr>
+      <w:r>
+        <w:t>Validation of synthetic clinical records against the data and coding requirements.</w:t>
+      </w:r>
+    </w:p>
+    <w:p>
+      <w:pPr>
+        <w:pStyle w:val="ListParagraph"/>
+        <w:numPr>
+          <w:ilvl w:val="0"/>
+          <w:numId w:val="3"/>
+        </w:numPr>
+      </w:pPr>
+      <w:r>
+        <w:t>Simulation of FHIR R4-based interactions with different mock clinical systems.</w:t>
+      </w:r>
+    </w:p>
+    <w:p>
+      <w:pPr>
+        <w:pStyle w:val="ListParagraph"/>
+        <w:numPr>
+          <w:ilvl w:val="0"/>
+          <w:numId w:val="3"/>
+        </w:numPr>
+      </w:pPr>
+      <w:r>
+        <w:t>Testing of SNOMED CT-AU code translations to ICD-10-AM and MBS codes.</w:t>
+      </w:r>
+    </w:p>
+    <w:p>
+      <w:pPr>
+        <w:pStyle w:val="ListParagraph"/>
+        <w:numPr>
+          <w:ilvl w:val="0"/>
+          <w:numId w:val="3"/>
+        </w:numPr>
+      </w:pPr>
+      <w:r>
+        <w:t>Simulation of invalid data and response times, as well as dropped connections.</w:t>
+      </w:r>
+    </w:p>
+    <w:p>
+      <w:pPr>
+        <w:pStyle w:val="ListParagraph"/>
+        <w:numPr>
+          <w:ilvl w:val="0"/>
+          <w:numId w:val="3"/>
+        </w:numPr>
+      </w:pPr>
+      <w:r>
+        <w:t>Execution of tests in an automated fashion and collection of pass/fail results.</w:t>
+      </w:r>
+    </w:p>
+    <w:p>
+      <w:pPr>
+        <w:pStyle w:val="ListParagraph"/>
+        <w:numPr>
+          <w:ilvl w:val="0"/>
+          <w:numId w:val="3"/>
+        </w:numPr>
+      </w:pPr>
+      <w:r>
+        <w:t>Generation of reports with test results and failures.</w:t>
+      </w:r>
+    </w:p>
+    <w:p>
+      <w:pPr>
+        <w:rPr>
+          <w:b/>
+          <w:bCs/>
+        </w:rPr>
+      </w:pPr>
+      <w:r>
+        <w:rPr>
+          <w:b/>
+          <w:bCs/>
+        </w:rPr>
+        <w:t>Out-of-scope</w:t>
+      </w:r>
+    </w:p>
+    <w:p>
+      <w:pPr>
+        <w:pStyle w:val="ListParagraph"/>
+        <w:numPr>
+          <w:ilvl w:val="0"/>
+          <w:numId w:val="4"/>
+        </w:numPr>
+      </w:pPr>
+      <w:r>
+        <w:t>Real patient data.</w:t>
+      </w:r>
+    </w:p>
+    <w:p>
+      <w:pPr>
+        <w:pStyle w:val="ListParagraph"/>
+        <w:numPr>
+          <w:ilvl w:val="0"/>
+          <w:numId w:val="4"/>
+        </w:numPr>
+      </w:pPr>
+      <w:r>
+        <w:t>Production MedTalk integration.</w:t>
+      </w:r>
+    </w:p>
+    <w:p>
+      <w:pPr>
+        <w:pStyle w:val="ListParagraph"/>
+        <w:numPr>
+          <w:ilvl w:val="0"/>
+          <w:numId w:val="4"/>
+        </w:numPr>
+      </w:pPr>
+      <w:r>
+        <w:t>Billing for real patients.</w:t>
+      </w:r>
+    </w:p>
+    <w:p>
+      <w:pPr>
+        <w:pStyle w:val="ListParagraph"/>
+        <w:numPr>
+          <w:ilvl w:val="0"/>
+          <w:numId w:val="4"/>
+        </w:numPr>
+      </w:pPr>
+      <w:r>
+        <w:t>Hosting and authentication in production.</w:t>
+      </w:r>
+    </w:p>
+    <w:p>
+      <w:pPr>
+        <w:pStyle w:val="ListParagraph"/>
+        <w:numPr>
+          <w:ilvl w:val="0"/>
+          <w:numId w:val="4"/>
+        </w:numPr>
+      </w:pPr>
+      <w:r>
+        <w:t>Coding/implementation in Stage 1, which is about requirements gathering and planning.</w:t>
+      </w:r>
+    </w:p>
+    <w:p/>
+    <w:p>
+      <w:pPr>
+        <w:pStyle w:val="Heading2"/>
+      </w:pPr>
+      <w:r>
+        <w:t>4.2. System overview</w:t>
+      </w:r>
+    </w:p>
+    <w:p>
+      <w:pPr>
+        <w:pStyle w:val="Heading3"/>
+      </w:pPr>
+      <w:r>
+        <w:t>4.2.1. Proposed solution Overview</w:t>
+      </w:r>
+    </w:p>
+    <w:p>
+      <w:r>
+        <w:t>The proposed solution is Synthetic FHIR R4 Sandbox &amp; Test Harness which provides a safe environment to test interactions between healthcare information systems. The test harness uses synthetic clinical data and FHIR interfaces to interact with mock clinical systems.</w:t>
+      </w:r>
+    </w:p>
+    <w:p>
+      <w:r>
+        <w:br w:type="page"/>
+      </w:r>
+    </w:p>
+    <w:p/>
+    <w:p>
+      <w:r>
+        <w:t>The proposed solution will allow test users and automated test mechanisms to:</w:t>
+      </w:r>
+    </w:p>
+    <w:p>
+      <w:pPr>
+        <w:pStyle w:val="ListParagraph"/>
+        <w:numPr>
+          <w:ilvl w:val="0"/>
+          <w:numId w:val="2"/>
+        </w:numPr>
+      </w:pPr>
+      <w:r>
+        <w:t>Load synthetic clinical data into sandbox.</w:t>
+      </w:r>
+    </w:p>
+    <w:p>
+      <w:pPr>
+        <w:pStyle w:val="ListParagraph"/>
+        <w:numPr>
+          <w:ilvl w:val="0"/>
+          <w:numId w:val="2"/>
+        </w:numPr>
+      </w:pPr>
+      <w:r>
+        <w:t>Validate structure and coding of clinical data.</w:t>
+      </w:r>
+    </w:p>
+    <w:p>
+      <w:pPr>
+        <w:pStyle w:val="ListParagraph"/>
+        <w:numPr>
+          <w:ilvl w:val="0"/>
+          <w:numId w:val="2"/>
+        </w:numPr>
+      </w:pPr>
+      <w:r>
+        <w:t>Perform FHIR R4 message exchange with mock clinical systems.</w:t>
+      </w:r>
+    </w:p>
+    <w:p>
+      <w:pPr>
+        <w:pStyle w:val="ListParagraph"/>
+        <w:numPr>
+          <w:ilvl w:val="0"/>
+          <w:numId w:val="2"/>
+        </w:numPr>
+      </w:pPr>
+      <w:r>
+        <w:t>Validate SNOMED CT-AU to ICD-10-AM and MBS code mappings.</w:t>
+      </w:r>
+    </w:p>
+    <w:p>
+      <w:pPr>
+        <w:pStyle w:val="ListParagraph"/>
+        <w:numPr>
+          <w:ilvl w:val="0"/>
+          <w:numId w:val="2"/>
+        </w:numPr>
+      </w:pPr>
+      <w:r>
+        <w:t>Introduce controlled faults such as data corruption, delays and connection drops.</w:t>
+      </w:r>
+    </w:p>
+    <w:p>
+      <w:pPr>
+        <w:pStyle w:val="ListParagraph"/>
+        <w:numPr>
+          <w:ilvl w:val="0"/>
+          <w:numId w:val="2"/>
+        </w:numPr>
+      </w:pPr>
+      <w:r>
+        <w:t xml:space="preserve">Validate actual vs expected system </w:t>
+      </w:r>
+      <w:proofErr w:type="spellStart"/>
+      <w:r>
+        <w:t>behavior</w:t>
+      </w:r>
+      <w:proofErr w:type="spellEnd"/>
+      <w:r>
+        <w:t>.</w:t>
+      </w:r>
+    </w:p>
+    <w:p>
+      <w:pPr>
+        <w:pStyle w:val="ListParagraph"/>
+        <w:numPr>
+          <w:ilvl w:val="0"/>
+          <w:numId w:val="2"/>
+        </w:numPr>
+      </w:pPr>
+      <w:r>
+        <w:t>Capture test results and failure reasons.</w:t>
+      </w:r>
+    </w:p>
+    <w:p>
+      <w:pPr>
+        <w:pStyle w:val="ListParagraph"/>
+        <w:numPr>
+          <w:ilvl w:val="0"/>
+          <w:numId w:val="2"/>
+        </w:numPr>
+      </w:pPr>
+      <w:r>
+        <w:t>Create automated test report.</w:t>
+      </w:r>
+    </w:p>
+    <w:p>
+      <w:r>
+        <w:t>The overall test scenario can be represented by the following chain of operations:</w:t>
+      </w:r>
+    </w:p>
+    <w:p>
+      <w:r>
+        <w:t>Synthetic Clinical Data → FHIR R4 Sandbox → Mock Clinical System → Validation/Mappings &amp; Faults Testing → Automated Test Results → Test Report.</w:t>
+      </w:r>
+    </w:p>
+    <w:p>
+      <w:r>
+        <w:t>The main goal of the solution is to demonstrate that integration is working as expected in normal and exceptional cases. The specified requirements clearly state that FHIR data exchange, synthetic SNOMED CT-AU, validation, fault injection and automated test reports are important capabilities.</w:t>
+      </w:r>
+    </w:p>
+    <w:p>
+      <w:pPr>
+        <w:pStyle w:val="Heading2"/>
+      </w:pPr>
+    </w:p>
+    <w:p>
+      <w:pPr>
+        <w:pStyle w:val="Heading2"/>
+      </w:pPr>
+      <w:r>
+        <w:t>4.3.</w:t>
+      </w:r>
+      <w:r>
+        <w:t xml:space="preserve"> Use Cases for Key Interactions</w:t>
+      </w:r>
+    </w:p>
+    <w:p>
+      <w:r>
+        <w:t>The use cases outline the interaction capabilities that the Synthetic FHIR R4 Sandbox &amp; Test Harness offers. They have been based on the confirmed scope of the project and the Functional Requirements FR1 - FR13. The use cases begin from the structured FHIR data boundary onwards. MedTalk AI, real clinical systems, production hosting, and production identity/auth are out of scope for these interactions.</w:t>
+      </w:r>
+    </w:p>
+    <w:p>
+      <w:r>
+        <w:t>The use cases to FR traceability are as follow:</w:t>
+      </w:r>
+    </w:p>
+    <w:tbl>
+      <w:tblPr>
+        <w:tblStyle w:val="GridTable1Light-Accent1"/>
+        <w:tblW w:w="0" w:type="auto"/>
+        <w:tblLook w:val="0020" w:firstRow="1" w:lastRow="0" w:firstColumn="0" w:lastColumn="0" w:noHBand="0" w:noVBand="0"/>
+      </w:tblPr>
+      <w:tblGrid>
+        <w:gridCol w:w="5422"/>
+        <w:gridCol w:w="1648"/>
+      </w:tblGrid>
+      <w:tr>
+        <w:trPr>
+          <w:cnfStyle w:val="100000000000" w:firstRow="1" w:lastRow="0" w:firstColumn="0" w:lastColumn="0" w:oddVBand="0" w:evenVBand="0" w:oddHBand="0" w:evenHBand="0" w:firstRowFirstColumn="0" w:firstRowLastColumn="0" w:lastRowFirstColumn="0" w:lastRowLastColumn="0"/>
+        </w:trPr>
+        <w:tc>
+          <w:tcPr>
+            <w:tcW w:w="0" w:type="auto"/>
+          </w:tcPr>
+          <w:p>
+            <w:pPr>
+              <w:spacing w:line="259" w:lineRule="auto"/>
+            </w:pPr>
+            <w:r>
+              <w:t>Use Case</w:t>
+            </w:r>
+          </w:p>
+        </w:tc>
+        <w:tc>
+          <w:tcPr>
+            <w:tcW w:w="0" w:type="auto"/>
+          </w:tcPr>
+          <w:p>
+            <w:pPr>
+              <w:spacing w:line="259" w:lineRule="auto"/>
+            </w:pPr>
+            <w:r>
+              <w:t>Related FRs</w:t>
+            </w:r>
+          </w:p>
+        </w:tc>
+      </w:tr>
+      <w:tr>
+        <w:tc>
+          <w:tcPr>
+            <w:tcW w:w="0" w:type="auto"/>
+          </w:tcPr>
+          <w:p>
+            <w:pPr>
+              <w:spacing w:line="259" w:lineRule="auto"/>
+            </w:pPr>
+            <w:r>
+              <w:t>UC-01 Load Synthetic Clinical Data</w:t>
+            </w:r>
+          </w:p>
+        </w:tc>
+        <w:tc>
+          <w:tcPr>
+            <w:tcW w:w="0" w:type="auto"/>
+          </w:tcPr>
+          <w:p>
+            <w:pPr>
+              <w:spacing w:line="259" w:lineRule="auto"/>
+            </w:pPr>
+            <w:r>
+              <w:t>FR3, FR4</w:t>
+            </w:r>
+          </w:p>
+        </w:tc>
+      </w:tr>
+      <w:tr>
+        <w:tc>
+          <w:tcPr>
+            <w:tcW w:w="0" w:type="auto"/>
+          </w:tcPr>
+          <w:p>
+            <w:pPr>
+              <w:spacing w:line="259" w:lineRule="auto"/>
+            </w:pPr>
+            <w:r>
+              <w:t>UC-02 Validate Synthetic Clinical Record</w:t>
+            </w:r>
+          </w:p>
+        </w:tc>
+        <w:tc>
+          <w:tcPr>
+            <w:tcW w:w="0" w:type="auto"/>
+          </w:tcPr>
+          <w:p>
+            <w:pPr>
+              <w:spacing w:line="259" w:lineRule="auto"/>
+            </w:pPr>
+            <w:r>
+              <w:t>FR5</w:t>
+            </w:r>
+          </w:p>
+        </w:tc>
+      </w:tr>
+      <w:tr>
+        <w:tc>
+          <w:tcPr>
+            <w:tcW w:w="0" w:type="auto"/>
+          </w:tcPr>
+          <w:p>
+            <w:pPr>
+              <w:spacing w:line="259" w:lineRule="auto"/>
+            </w:pPr>
+            <w:r>
+              <w:t>UC-03 Exchange FHIR Data with Mock Clinical Systems</w:t>
+            </w:r>
+          </w:p>
+        </w:tc>
+        <w:tc>
+          <w:tcPr>
+            <w:tcW w:w="0" w:type="auto"/>
+          </w:tcPr>
+          <w:p>
+            <w:pPr>
+              <w:spacing w:line="259" w:lineRule="auto"/>
+            </w:pPr>
+            <w:r>
+              <w:t>FR1, FR2</w:t>
+            </w:r>
+          </w:p>
+        </w:tc>
+      </w:tr>
+      <w:tr>
+        <w:tc>
+          <w:tcPr>
+            <w:tcW w:w="0" w:type="auto"/>
+          </w:tcPr>
+          <w:p>
+            <w:pPr>
+              <w:spacing w:line="259" w:lineRule="auto"/>
+            </w:pPr>
+            <w:r>
+              <w:t>UC-04 Perform SNOMED CT-AU Mapping Checks</w:t>
+            </w:r>
+          </w:p>
+        </w:tc>
+        <w:tc>
+          <w:tcPr>
+            <w:tcW w:w="0" w:type="auto"/>
+          </w:tcPr>
+          <w:p>
+            <w:pPr>
+              <w:spacing w:line="259" w:lineRule="auto"/>
+            </w:pPr>
+            <w:r>
+              <w:t>FR6, FR7</w:t>
+            </w:r>
+          </w:p>
+        </w:tc>
+      </w:tr>
+      <w:tr>
+        <w:tc>
+          <w:tcPr>
+            <w:tcW w:w="0" w:type="auto"/>
+          </w:tcPr>
+          <w:p>
+            <w:pPr>
+              <w:spacing w:line="259" w:lineRule="auto"/>
+            </w:pPr>
+            <w:r>
+              <w:t>UC-05 Execute Fault-Injection Test</w:t>
+            </w:r>
+          </w:p>
+        </w:tc>
+        <w:tc>
+          <w:tcPr>
+            <w:tcW w:w="0" w:type="auto"/>
+          </w:tcPr>
+          <w:p>
+            <w:pPr>
+              <w:spacing w:line="259" w:lineRule="auto"/>
+            </w:pPr>
+            <w:r>
+              <w:t>FR8, FR9, FR10</w:t>
+            </w:r>
+          </w:p>
+        </w:tc>
+      </w:tr>
+      <w:tr>
+        <w:tc>
+          <w:tcPr>
+            <w:tcW w:w="0" w:type="auto"/>
+          </w:tcPr>
+          <w:p>
+            <w:pPr>
+              <w:spacing w:line="259" w:lineRule="auto"/>
+            </w:pPr>
+            <w:r>
+              <w:t>UC-06 Execute Automated Test and Record Result</w:t>
+            </w:r>
+          </w:p>
+        </w:tc>
+        <w:tc>
+          <w:tcPr>
+            <w:tcW w:w="0" w:type="auto"/>
+          </w:tcPr>
+          <w:p>
+            <w:pPr>
+              <w:spacing w:line="259" w:lineRule="auto"/>
+            </w:pPr>
+            <w:r>
+              <w:t>FR11, FR12</w:t>
+            </w:r>
+          </w:p>
+        </w:tc>
+      </w:tr>
+      <w:tr>
+        <w:tc>
+          <w:tcPr>
+            <w:tcW w:w="0" w:type="auto"/>
+          </w:tcPr>
+          <w:p>
+            <w:pPr>
+              <w:spacing w:line="259" w:lineRule="auto"/>
+            </w:pPr>
+            <w:r>
+              <w:t>UC-07 Generate Automated Test Report</w:t>
+            </w:r>
+          </w:p>
+        </w:tc>
+        <w:tc>
+          <w:tcPr>
+            <w:tcW w:w="0" w:type="auto"/>
+          </w:tcPr>
+          <w:p>
+            <w:pPr>
+              <w:spacing w:line="259" w:lineRule="auto"/>
+            </w:pPr>
+            <w:r>
+              <w:t>FR13</w:t>
+            </w:r>
+          </w:p>
+        </w:tc>
+      </w:tr>
+    </w:tbl>
+    <w:p>
+      <w:pPr>
+        <w:rPr>
+          <w:b/>
+          <w:bCs/>
+        </w:rPr>
+      </w:pPr>
+      <w:r>
+        <w:rPr>
+          <w:b/>
+          <w:bCs/>
+        </w:rPr>
+        <w:br w:type="page"/>
+      </w:r>
+    </w:p>
+    <w:p>
+      <w:pPr>
+        <w:rPr>
+          <w:b/>
+          <w:bCs/>
+        </w:rPr>
+      </w:pPr>
+      <w:r>
+        <w:rPr>
+          <w:b/>
+          <w:bCs/>
+        </w:rPr>
+        <w:lastRenderedPageBreak/>
+        <w:t>UC-01: Load Synthetic Clinical Data</w:t>
+      </w:r>
+    </w:p>
+    <w:p>
+      <w:r>
+        <w:t>Primary Actor: Test User / Test Harness</w:t>
+      </w:r>
+    </w:p>
+    <w:p>
+      <w:r>
+        <w:t>Goal: To load synthetic patient and clinical records into the synthetic healthcare environment.</w:t>
+      </w:r>
+    </w:p>
+    <w:p>
+      <w:r>
+        <w:t>Functional Requirements Related: FR3, FR4</w:t>
+      </w:r>
+    </w:p>
+    <w:p/>
+    <w:p>
+      <w:pPr>
+        <w:rPr>
+          <w:b/>
+          <w:bCs/>
+        </w:rPr>
+      </w:pPr>
+      <w:r>
+        <w:rPr>
+          <w:b/>
+          <w:bCs/>
+        </w:rPr>
+        <w:t>Pre-Conditions</w:t>
+      </w:r>
+    </w:p>
+    <w:p>
+      <w:r>
+        <w:t>The synthetic FHIR R4 sandbox is accessible.</w:t>
+      </w:r>
+    </w:p>
+    <w:p>
+      <w:r>
+        <w:t>A synthetic dataset is accessible.</w:t>
+      </w:r>
+    </w:p>
+    <w:p>
+      <w:r>
+        <w:t>The dataset includes the necessary clinical resources and codes.</w:t>
+      </w:r>
+    </w:p>
+    <w:p>
+      <w:pPr>
+        <w:rPr>
+          <w:b/>
+          <w:bCs/>
+        </w:rPr>
+      </w:pPr>
+    </w:p>
+    <w:p>
+      <w:pPr>
+        <w:rPr>
+          <w:b/>
+          <w:bCs/>
+        </w:rPr>
+      </w:pPr>
+      <w:r>
+        <w:rPr>
+          <w:b/>
+          <w:bCs/>
+        </w:rPr>
+        <w:t>Main Flow</w:t>
+      </w:r>
+    </w:p>
+    <w:p>
+      <w:r>
+        <w:t>The test user chooses or starts to load a synthetic dataset.</w:t>
+      </w:r>
+    </w:p>
+    <w:p>
+      <w:r>
+        <w:t>The test harness parses the synthetic patient and clinical records.</w:t>
+      </w:r>
+    </w:p>
+    <w:p>
+      <w:r>
+        <w:t>The test harness verifies the possibility to process the records.</w:t>
+      </w:r>
+    </w:p>
+    <w:p>
+      <w:r>
+        <w:t>The records are loaded into the synthetic environment.</w:t>
+      </w:r>
+    </w:p>
+    <w:p>
+      <w:r>
+        <w:t>The records are saved in the PostgreSQL environment.</w:t>
+      </w:r>
+    </w:p>
+    <w:p>
+      <w:r>
+        <w:t>The test harness saves the result of the data loading operation.</w:t>
+      </w:r>
+    </w:p>
+    <w:p>
+      <w:r>
+        <w:t>The loaded records become available for further testing.</w:t>
+      </w:r>
+    </w:p>
+    <w:p>
+      <w:pPr>
+        <w:rPr>
+          <w:b/>
+          <w:bCs/>
+        </w:rPr>
+      </w:pPr>
+      <w:r>
+        <w:rPr>
+          <w:b/>
+          <w:bCs/>
+        </w:rPr>
+        <w:t>Alternate/Exceptional Flows</w:t>
+      </w:r>
+    </w:p>
+    <w:p>
+      <w:r>
+        <w:t>If the dataset is impossible to process, the load operation is declined and the error is logged.</w:t>
+      </w:r>
+    </w:p>
+    <w:p>
+      <w:r>
+        <w:t>If the record doesn’t meet the predefined validation requirements, the record is recognized as an invalid one and not processed silently.</w:t>
+      </w:r>
+    </w:p>
+    <w:p>
+      <w:pPr>
+        <w:rPr>
+          <w:b/>
+          <w:bCs/>
+        </w:rPr>
+      </w:pPr>
+      <w:r>
+        <w:rPr>
+          <w:b/>
+          <w:bCs/>
+        </w:rPr>
+        <w:t>Expected Result</w:t>
+      </w:r>
+    </w:p>
+    <w:p>
+      <w:r>
+        <w:t>Synthetic clinical records are successfully loaded and available for testing.</w:t>
+      </w:r>
+    </w:p>
+    <w:p/>
+    <w:p>
+      <w:pPr>
+        <w:rPr>
+          <w:b/>
+          <w:bCs/>
+        </w:rPr>
+      </w:pPr>
+      <w:r>
+        <w:rPr>
+          <w:b/>
+          <w:bCs/>
+        </w:rPr>
+        <w:br w:type="page"/>
+      </w:r>
+    </w:p>
+    <w:p>
+      <w:pPr>
+        <w:rPr>
+          <w:b/>
+          <w:bCs/>
+        </w:rPr>
+      </w:pPr>
+      <w:r>
+        <w:rPr>
+          <w:b/>
+          <w:bCs/>
+        </w:rPr>
+        <w:lastRenderedPageBreak/>
+        <w:t>UC-02: Validate Synthetic Clinical Record</w:t>
+      </w:r>
+    </w:p>
+    <w:p/>
+    <w:p>
+      <w:r>
+        <w:rPr>
+          <w:b/>
+          <w:bCs/>
+        </w:rPr>
+        <w:t>Actor</w:t>
+      </w:r>
+      <w:r>
+        <w:t>: Test Harness – Validation Module</w:t>
+      </w:r>
+    </w:p>
+    <w:p>
+      <w:r>
+        <w:rPr>
+          <w:b/>
+          <w:bCs/>
+        </w:rPr>
+        <w:t>Purpose</w:t>
+      </w:r>
+      <w:r>
+        <w:t>: Establish if a synthetic clinical record meets the structural and coding criteria that have been specified.</w:t>
+      </w:r>
+    </w:p>
+    <w:p>
+      <w:pPr>
+        <w:rPr>
+          <w:b/>
+          <w:bCs/>
+        </w:rPr>
+      </w:pPr>
+      <w:r>
+        <w:rPr>
+          <w:b/>
+          <w:bCs/>
+        </w:rPr>
+        <w:t>Associated Functional Requirement: FR5</w:t>
+      </w:r>
+    </w:p>
+    <w:p/>
+    <w:p>
+      <w:pPr>
+        <w:rPr>
+          <w:b/>
+          <w:bCs/>
+        </w:rPr>
+      </w:pPr>
+      <w:r>
+        <w:rPr>
+          <w:b/>
+          <w:bCs/>
+        </w:rPr>
+        <w:t>Prerequisites</w:t>
+      </w:r>
+    </w:p>
+    <w:p>
+      <w:r>
+        <w:t>The synthetic clinical record has been delivered to the test harness.</w:t>
+      </w:r>
+    </w:p>
+    <w:p>
+      <w:r>
+        <w:t>Criteria by which the validation can be performed have been established.</w:t>
+      </w:r>
+    </w:p>
+    <w:p>
+      <w:pPr>
+        <w:rPr>
+          <w:b/>
+          <w:bCs/>
+        </w:rPr>
+      </w:pPr>
+    </w:p>
+    <w:p>
+      <w:pPr>
+        <w:rPr>
+          <w:b/>
+          <w:bCs/>
+        </w:rPr>
+      </w:pPr>
+      <w:r>
+        <w:rPr>
+          <w:b/>
+          <w:bCs/>
+        </w:rPr>
+        <w:t>Flow</w:t>
+      </w:r>
+    </w:p>
+    <w:p>
+      <w:r>
+        <w:t>The test harness gets the clinical record.</w:t>
+      </w:r>
+    </w:p>
+    <w:p>
+      <w:r>
+        <w:t>The validation module tests the required fields and structure.</w:t>
+      </w:r>
+    </w:p>
+    <w:p>
+      <w:r>
+        <w:t>The validation module tests the required coding.</w:t>
+      </w:r>
+    </w:p>
+    <w:p>
+      <w:r>
+        <w:t>The SNOMED CT-AU coded clinical data is tested to meet the specified requirements.</w:t>
+      </w:r>
+    </w:p>
+    <w:p>
+      <w:r>
+        <w:t>The validation module establishes if the record has passed or failed the validation process.</w:t>
+      </w:r>
+    </w:p>
+    <w:p>
+      <w:r>
+        <w:t>The result of the validation is registered.</w:t>
+      </w:r>
+    </w:p>
+    <w:p>
+      <w:pPr>
+        <w:rPr>
+          <w:b/>
+          <w:bCs/>
+        </w:rPr>
+      </w:pPr>
+    </w:p>
+    <w:p>
+      <w:pPr>
+        <w:rPr>
+          <w:b/>
+          <w:bCs/>
+        </w:rPr>
+      </w:pPr>
+      <w:r>
+        <w:rPr>
+          <w:b/>
+          <w:bCs/>
+        </w:rPr>
+        <w:t>Exceptions / Alternative Flow</w:t>
+      </w:r>
+    </w:p>
+    <w:p>
+      <w:r>
+        <w:t>If the required field is not there, the validation is considered failed.</w:t>
+      </w:r>
+    </w:p>
+    <w:p>
+      <w:r>
+        <w:t>If the resource does not comply with the expected FHIR/AU Core structure, the record is rejected/put into the validation failure status.</w:t>
+      </w:r>
+    </w:p>
+    <w:p>
+      <w:r>
+        <w:t>If a coding is invalid, the validation failure is recorded together with the reason.</w:t>
+      </w:r>
+    </w:p>
+    <w:p>
+      <w:pPr>
+        <w:rPr>
+          <w:b/>
+          <w:bCs/>
+        </w:rPr>
+      </w:pPr>
+    </w:p>
+    <w:p>
+      <w:pPr>
+        <w:rPr>
+          <w:b/>
+          <w:bCs/>
+        </w:rPr>
+      </w:pPr>
+      <w:r>
+        <w:rPr>
+          <w:b/>
+          <w:bCs/>
+        </w:rPr>
+        <w:t>Expected Result</w:t>
+      </w:r>
+    </w:p>
+    <w:p>
+      <w:r>
+        <w:t>The validation result and the reason for the failure, if any, are established for the record.</w:t>
+      </w:r>
+    </w:p>
+    <w:p/>
+    <w:p>
+      <w:pPr>
+        <w:rPr>
+          <w:b/>
+          <w:bCs/>
+        </w:rPr>
+      </w:pPr>
+      <w:r>
+        <w:rPr>
+          <w:b/>
+          <w:bCs/>
+        </w:rPr>
+        <w:br w:type="page"/>
+      </w:r>
+    </w:p>
+    <w:p>
+      <w:pPr>
+        <w:rPr>
+          <w:b/>
+          <w:bCs/>
+        </w:rPr>
+      </w:pPr>
+      <w:r>
+        <w:rPr>
+          <w:b/>
+          <w:bCs/>
+        </w:rPr>
+        <w:lastRenderedPageBreak/>
+        <w:t>UC-03: Interact With Mock Clinical System Using FHIR Data</w:t>
+      </w:r>
+    </w:p>
+    <w:p/>
+    <w:p>
+      <w:r>
+        <w:rPr>
+          <w:b/>
+          <w:bCs/>
+        </w:rPr>
+        <w:t>Primary Actor</w:t>
+      </w:r>
+      <w:r>
+        <w:t>: Test Harness</w:t>
+      </w:r>
+    </w:p>
+    <w:p>
+      <w:r>
+        <w:rPr>
+          <w:b/>
+          <w:bCs/>
+        </w:rPr>
+        <w:t>Secondary Actors</w:t>
+      </w:r>
+      <w:r>
+        <w:t>: Synthetic FHIR R4 Sandbox, Mock Clinical System</w:t>
+      </w:r>
+    </w:p>
+    <w:p>
+      <w:r>
+        <w:rPr>
+          <w:b/>
+          <w:bCs/>
+        </w:rPr>
+        <w:t>Goal</w:t>
+      </w:r>
+      <w:r>
+        <w:t>: To test interactions between the sandbox and clinical system using FHIR.</w:t>
+      </w:r>
+    </w:p>
+    <w:p>
+      <w:pPr>
+        <w:rPr>
+          <w:b/>
+          <w:bCs/>
+        </w:rPr>
+      </w:pPr>
+      <w:r>
+        <w:rPr>
+          <w:b/>
+          <w:bCs/>
+        </w:rPr>
+        <w:t>Functional Requirements that Support this UC: FR1, FR2</w:t>
+      </w:r>
+    </w:p>
+    <w:p>
+      <w:pPr>
+        <w:rPr>
+          <w:b/>
+          <w:bCs/>
+        </w:rPr>
+      </w:pPr>
+    </w:p>
+    <w:p>
+      <w:pPr>
+        <w:rPr>
+          <w:b/>
+          <w:bCs/>
+        </w:rPr>
+      </w:pPr>
+      <w:r>
+        <w:rPr>
+          <w:b/>
+          <w:bCs/>
+        </w:rPr>
+        <w:t>Precondition</w:t>
+      </w:r>
+    </w:p>
+    <w:p>
+      <w:r>
+        <w:t>Synthetic FHIR R4 sandbox should be up and running.</w:t>
+      </w:r>
+    </w:p>
+    <w:p>
+      <w:r>
+        <w:t>Mock clinical system should be present.</w:t>
+      </w:r>
+    </w:p>
+    <w:p>
+      <w:r>
+        <w:t>FHIR resource should be present for testing.</w:t>
+      </w:r>
+    </w:p>
+    <w:p>
+      <w:pPr>
+        <w:rPr>
+          <w:b/>
+          <w:bCs/>
+        </w:rPr>
+      </w:pPr>
+    </w:p>
+    <w:p>
+      <w:pPr>
+        <w:rPr>
+          <w:b/>
+          <w:bCs/>
+        </w:rPr>
+      </w:pPr>
+      <w:r>
+        <w:rPr>
+          <w:b/>
+          <w:bCs/>
+        </w:rPr>
+        <w:t>Main flow</w:t>
+      </w:r>
+    </w:p>
+    <w:p>
+      <w:r>
+        <w:t>Test harness creates FHIR R4 request.</w:t>
+      </w:r>
+    </w:p>
+    <w:p>
+      <w:r>
+        <w:t>Request is passed via simulated interaction between connector/API.</w:t>
+      </w:r>
+    </w:p>
+    <w:p>
+      <w:r>
+        <w:t>Selected mock clinical system receives request.</w:t>
+      </w:r>
+    </w:p>
+    <w:p>
+      <w:r>
+        <w:t>Mock clinical system processes the request based on behavioural model defined.</w:t>
+      </w:r>
+    </w:p>
+    <w:p>
+      <w:r>
+        <w:t>Response is received from mock clinical system.</w:t>
+      </w:r>
+    </w:p>
+    <w:p>
+      <w:r>
+        <w:t>Result from mock clinical system is evaluated by test harness against expected result.</w:t>
+      </w:r>
+    </w:p>
+    <w:p>
+      <w:r>
+        <w:t>Result is recorded.</w:t>
+      </w:r>
+    </w:p>
+    <w:p/>
+    <w:p>
+      <w:pPr>
+        <w:rPr>
+          <w:b/>
+          <w:bCs/>
+        </w:rPr>
+      </w:pPr>
+      <w:r>
+        <w:rPr>
+          <w:b/>
+          <w:bCs/>
+        </w:rPr>
+        <w:t>Alternate/Exception flows</w:t>
+      </w:r>
+    </w:p>
+    <w:p>
+      <w:r>
+        <w:t>Mock clinical system may generate structured error.</w:t>
+      </w:r>
+    </w:p>
+    <w:p>
+      <w:r>
+        <w:t>Malformed request data may be passed.</w:t>
+      </w:r>
+    </w:p>
+    <w:p>
+      <w:r>
+        <w:t>Connection can be intentionally delayed or dropped as part of fault injection testing.</w:t>
+      </w:r>
+    </w:p>
+    <w:p>
+      <w:pPr>
+        <w:rPr>
+          <w:b/>
+          <w:bCs/>
+        </w:rPr>
+      </w:pPr>
+    </w:p>
+    <w:p>
+      <w:pPr>
+        <w:rPr>
+          <w:b/>
+          <w:bCs/>
+        </w:rPr>
+      </w:pPr>
+      <w:r>
+        <w:rPr>
+          <w:b/>
+          <w:bCs/>
+        </w:rPr>
+        <w:t>Expected Result</w:t>
+      </w:r>
+    </w:p>
+    <w:p>
+      <w:r>
+        <w:t>Test harness successfully tests FHIR interaction and determines if the expected behaviour was observed.</w:t>
+      </w:r>
+    </w:p>
+    <w:p>
+      <w:r>
+        <w:br w:type="page"/>
+      </w:r>
+    </w:p>
+    <w:p>
+      <w:pPr>
+        <w:rPr>
+          <w:b/>
+          <w:bCs/>
+        </w:rPr>
+      </w:pPr>
+      <w:r>
+        <w:rPr>
+          <w:b/>
+          <w:bCs/>
+        </w:rPr>
+        <w:lastRenderedPageBreak/>
+        <w:t>UC-04 Perform SNOMED CT-AU Mapping Checks</w:t>
+      </w:r>
+    </w:p>
+    <w:p/>
+    <w:p>
+      <w:r>
+        <w:rPr>
+          <w:b/>
+          <w:bCs/>
+        </w:rPr>
+        <w:t>Primary Actor</w:t>
+      </w:r>
+      <w:r>
+        <w:t>: Test Harness - Mapping Module</w:t>
+      </w:r>
+    </w:p>
+    <w:p>
+      <w:r>
+        <w:rPr>
+          <w:b/>
+          <w:bCs/>
+        </w:rPr>
+        <w:t>Goal</w:t>
+      </w:r>
+      <w:r>
+        <w:t>: Validate mappings between SNOMED CT-AU concepts and ICD-10-AM/MBS codes.</w:t>
+      </w:r>
+    </w:p>
+    <w:p>
+      <w:pPr>
+        <w:rPr>
+          <w:b/>
+          <w:bCs/>
+        </w:rPr>
+      </w:pPr>
+      <w:r>
+        <w:rPr>
+          <w:b/>
+          <w:bCs/>
+        </w:rPr>
+        <w:t>Related Functional Requirements: FR6, FR7</w:t>
+      </w:r>
+    </w:p>
+    <w:p>
+      <w:pPr>
+        <w:rPr>
+          <w:b/>
+          <w:bCs/>
+        </w:rPr>
+      </w:pPr>
+    </w:p>
+    <w:p>
+      <w:pPr>
+        <w:rPr>
+          <w:b/>
+          <w:bCs/>
+        </w:rPr>
+      </w:pPr>
+      <w:r>
+        <w:rPr>
+          <w:b/>
+          <w:bCs/>
+        </w:rPr>
+        <w:t>Preconditions</w:t>
+      </w:r>
+    </w:p>
+    <w:p>
+      <w:r>
+        <w:t>Synthetic clinical condition that includes SNOMED CT-AU concept is available.</w:t>
+      </w:r>
+    </w:p>
+    <w:p>
+      <w:r>
+        <w:t>Mapping rules and value set tables are available.</w:t>
+      </w:r>
+    </w:p>
+    <w:p>
+      <w:r>
+        <w:t>Test case has expected outcome.</w:t>
+      </w:r>
+    </w:p>
+    <w:p>
+      <w:pPr>
+        <w:rPr>
+          <w:b/>
+          <w:bCs/>
+        </w:rPr>
+      </w:pPr>
+    </w:p>
+    <w:p>
+      <w:pPr>
+        <w:rPr>
+          <w:b/>
+          <w:bCs/>
+        </w:rPr>
+      </w:pPr>
+      <w:r>
+        <w:rPr>
+          <w:b/>
+          <w:bCs/>
+        </w:rPr>
+        <w:t>Main Flow</w:t>
+      </w:r>
+    </w:p>
+    <w:p>
+      <w:r>
+        <w:t>Mapping module receives SNOMED CT-AU-coded clinical concept.</w:t>
+      </w:r>
+    </w:p>
+    <w:p>
+      <w:r>
+        <w:t>Module identifies mapping rule for the concept.</w:t>
+      </w:r>
+    </w:p>
+    <w:p>
+      <w:r>
+        <w:t>SNOMED CT-AU concept is validated for ICD-10-AM mapping.</w:t>
+      </w:r>
+    </w:p>
+    <w:p>
+      <w:r>
+        <w:t>SNOMED CT-AU concept is validated for MBS mapping if relevant.</w:t>
+      </w:r>
+    </w:p>
+    <w:p>
+      <w:r>
+        <w:t>Actual mapping outcome is compared to the expected one.</w:t>
+      </w:r>
+    </w:p>
+    <w:p>
+      <w:r>
+        <w:t>Mapping outcome comparison is recorded by the test harness.</w:t>
+      </w:r>
+    </w:p>
+    <w:p>
+      <w:r>
+        <w:t>Result of the mapping is included in automated test report.</w:t>
+      </w:r>
+    </w:p>
+    <w:p>
+      <w:pPr>
+        <w:rPr>
+          <w:b/>
+          <w:bCs/>
+        </w:rPr>
+      </w:pPr>
+    </w:p>
+    <w:p>
+      <w:pPr>
+        <w:rPr>
+          <w:b/>
+          <w:bCs/>
+        </w:rPr>
+      </w:pPr>
+      <w:r>
+        <w:rPr>
+          <w:b/>
+          <w:bCs/>
+        </w:rPr>
+        <w:t>Alternative/Exception Flows</w:t>
+      </w:r>
+    </w:p>
+    <w:p>
+      <w:r>
+        <w:t>When there is no mapping, the concept is identified as unmapped.</w:t>
+      </w:r>
+    </w:p>
+    <w:p>
+      <w:r>
+        <w:t>When there is more than one mapping option available, the test case is defined as edge case.</w:t>
+      </w:r>
+    </w:p>
+    <w:p>
+      <w:r>
+        <w:t>If actual outcome does not match the expected one, the test fails and discrepancy is recorded.</w:t>
+      </w:r>
+    </w:p>
+    <w:p>
+      <w:pPr>
+        <w:rPr>
+          <w:b/>
+          <w:bCs/>
+        </w:rPr>
+      </w:pPr>
+    </w:p>
+    <w:p>
+      <w:pPr>
+        <w:rPr>
+          <w:b/>
+          <w:bCs/>
+        </w:rPr>
+      </w:pPr>
+      <w:r>
+        <w:rPr>
+          <w:b/>
+          <w:bCs/>
+        </w:rPr>
+        <w:t>Expected Outcome</w:t>
+      </w:r>
+    </w:p>
+    <w:p>
+      <w:r>
+        <w:t>Mapping test validates whether the expected outcome for ICD-10-AM/MBS mapping is received, including edge cases.</w:t>
+      </w:r>
+    </w:p>
+    <w:p/>
+    <w:p>
+      <w:r>
+        <w:br w:type="page"/>
+      </w:r>
+    </w:p>
+    <w:p>
+      <w:pPr>
+        <w:rPr>
+          <w:b/>
+          <w:bCs/>
+        </w:rPr>
+      </w:pPr>
+      <w:r>
+        <w:rPr>
+          <w:b/>
+          <w:bCs/>
+        </w:rPr>
+        <w:lastRenderedPageBreak/>
+        <w:t>UC-05: Perform Fault Injection Testing</w:t>
+      </w:r>
+    </w:p>
+    <w:p>
+      <w:r>
+        <w:rPr>
+          <w:b/>
+          <w:bCs/>
+        </w:rPr>
+        <w:t>Primary Actor</w:t>
+      </w:r>
+      <w:r>
+        <w:t>: Tester / Test Harness</w:t>
+      </w:r>
+    </w:p>
+    <w:p>
+      <w:r>
+        <w:rPr>
+          <w:b/>
+          <w:bCs/>
+        </w:rPr>
+        <w:t>Goal</w:t>
+      </w:r>
+      <w:r>
+        <w:t xml:space="preserve">: Validate the </w:t>
+      </w:r>
+      <w:proofErr w:type="spellStart"/>
+      <w:r>
+        <w:t>behavior</w:t>
+      </w:r>
+      <w:proofErr w:type="spellEnd"/>
+      <w:r>
+        <w:t xml:space="preserve"> of the simulated healthcare ecosystem under intentionally generated invalid or unreliable conditions.</w:t>
+      </w:r>
+    </w:p>
+    <w:p>
+      <w:pPr>
+        <w:rPr>
+          <w:b/>
+          <w:bCs/>
+        </w:rPr>
+      </w:pPr>
+      <w:r>
+        <w:rPr>
+          <w:b/>
+          <w:bCs/>
+        </w:rPr>
+        <w:t>Related Functional Requirements: FR8, FR9, FR10</w:t>
+      </w:r>
+    </w:p>
+    <w:p/>
+    <w:p>
+      <w:pPr>
+        <w:rPr>
+          <w:b/>
+          <w:bCs/>
+        </w:rPr>
+      </w:pPr>
+      <w:r>
+        <w:rPr>
+          <w:b/>
+          <w:bCs/>
+        </w:rPr>
+        <w:t>Preconditions</w:t>
+      </w:r>
+    </w:p>
+    <w:p>
+      <w:r>
+        <w:t>Test harness and selected mock clinical system are available.</w:t>
+      </w:r>
+    </w:p>
+    <w:p>
+      <w:r>
+        <w:t>Fault injection testing scenario is defined.</w:t>
+      </w:r>
+    </w:p>
+    <w:p>
+      <w:pPr>
+        <w:rPr>
+          <w:b/>
+          <w:bCs/>
+        </w:rPr>
+      </w:pPr>
+    </w:p>
+    <w:p>
+      <w:pPr>
+        <w:rPr>
+          <w:b/>
+          <w:bCs/>
+        </w:rPr>
+      </w:pPr>
+      <w:r>
+        <w:rPr>
+          <w:b/>
+          <w:bCs/>
+        </w:rPr>
+        <w:t>Main Flow</w:t>
+      </w:r>
+    </w:p>
+    <w:p>
+      <w:r>
+        <w:t>Tester or automated test harness selects the fault scenario.</w:t>
+      </w:r>
+    </w:p>
+    <w:p>
+      <w:r>
+        <w:t>Fault is injected by the test harness.</w:t>
+      </w:r>
+    </w:p>
+    <w:p>
+      <w:r>
+        <w:t>Selected mock system processes the request.</w:t>
+      </w:r>
+    </w:p>
+    <w:p>
+      <w:r>
+        <w:t xml:space="preserve">The resulting </w:t>
+      </w:r>
+      <w:proofErr w:type="spellStart"/>
+      <w:r>
+        <w:t>behavior</w:t>
+      </w:r>
+      <w:proofErr w:type="spellEnd"/>
+      <w:r>
+        <w:t xml:space="preserve"> is captured by the test harness.</w:t>
+      </w:r>
+    </w:p>
+    <w:p>
+      <w:r>
+        <w:t xml:space="preserve">The actual </w:t>
+      </w:r>
+      <w:proofErr w:type="spellStart"/>
+      <w:r>
+        <w:t>behavior</w:t>
+      </w:r>
+      <w:proofErr w:type="spellEnd"/>
+      <w:r>
+        <w:t xml:space="preserve"> is evaluated against the expected </w:t>
+      </w:r>
+      <w:proofErr w:type="spellStart"/>
+      <w:r>
+        <w:t>behavior</w:t>
+      </w:r>
+      <w:proofErr w:type="spellEnd"/>
+      <w:r>
+        <w:t>.</w:t>
+      </w:r>
+    </w:p>
+    <w:p>
+      <w:r>
+        <w:t>The outcome of the test is registered.</w:t>
+      </w:r>
+    </w:p>
+    <w:p>
+      <w:r>
+        <w:t>Reason of any failure is registered.</w:t>
+      </w:r>
+    </w:p>
+    <w:p/>
+    <w:p>
+      <w:pPr>
+        <w:rPr>
+          <w:b/>
+          <w:bCs/>
+        </w:rPr>
+      </w:pPr>
+      <w:r>
+        <w:rPr>
+          <w:b/>
+          <w:bCs/>
+        </w:rPr>
+        <w:t>Fault Scenarios</w:t>
+      </w:r>
+    </w:p>
+    <w:p>
+      <w:r>
+        <w:t>1. Invalid request</w:t>
+      </w:r>
+    </w:p>
+    <w:p>
+      <w:r>
+        <w:t>The invalid request is refused.</w:t>
+      </w:r>
+    </w:p>
+    <w:p>
+      <w:r>
+        <w:t>Structured error message is generated and Failure is logged.</w:t>
+      </w:r>
+    </w:p>
+    <w:p/>
+    <w:p>
+      <w:r>
+        <w:t>2. Delayed request</w:t>
+      </w:r>
+    </w:p>
+    <w:p>
+      <w:r>
+        <w:t>Timeout is reached while processing the request.</w:t>
+      </w:r>
+    </w:p>
+    <w:p>
+      <w:r>
+        <w:t>Timeout failure is considered separate type of failure.</w:t>
+      </w:r>
+    </w:p>
+    <w:p/>
+    <w:p>
+      <w:r>
+        <w:t xml:space="preserve">3. lost Connection </w:t>
+      </w:r>
+    </w:p>
+    <w:p>
+      <w:r>
+        <w:t>Operation performs according to predefined retry/recovery policy.</w:t>
+      </w:r>
+    </w:p>
+    <w:p>
+      <w:r>
+        <w:t>Operational failure is logged and reported.</w:t>
+      </w:r>
+    </w:p>
+    <w:p/>
+    <w:p>
+      <w:pPr>
+        <w:rPr>
+          <w:b/>
+          <w:bCs/>
+        </w:rPr>
+      </w:pPr>
+      <w:r>
+        <w:rPr>
+          <w:b/>
+          <w:bCs/>
+        </w:rPr>
+        <w:t>Expected Result</w:t>
+      </w:r>
+    </w:p>
+    <w:p>
+      <w:r>
+        <w:t xml:space="preserve">The test harness demonstrates and registers expected </w:t>
+      </w:r>
+      <w:proofErr w:type="spellStart"/>
+      <w:r>
+        <w:t>behavior</w:t>
+      </w:r>
+      <w:proofErr w:type="spellEnd"/>
+      <w:r>
+        <w:t xml:space="preserve"> under selected failure scenario.</w:t>
+      </w:r>
+    </w:p>
+    <w:p/>
+    <w:p>
+      <w:pPr>
+        <w:rPr>
+          <w:b/>
+          <w:bCs/>
+        </w:rPr>
+      </w:pPr>
+      <w:r>
+        <w:rPr>
+          <w:b/>
+          <w:bCs/>
+        </w:rPr>
+        <w:t>UC-06 Execute Automated Test and Record Result</w:t>
+      </w:r>
+    </w:p>
+    <w:p/>
+    <w:p>
+      <w:r>
+        <w:rPr>
+          <w:b/>
+          <w:bCs/>
+        </w:rPr>
+        <w:t>Primary Actor</w:t>
+      </w:r>
+      <w:r>
+        <w:t>: Test Harness – Test Run Module</w:t>
+      </w:r>
+    </w:p>
+    <w:p>
+      <w:r>
+        <w:rPr>
+          <w:b/>
+          <w:bCs/>
+        </w:rPr>
+        <w:t>Goal</w:t>
+      </w:r>
+      <w:r>
+        <w:t>: Run a test case automatically and log the pass/fail status of the test.</w:t>
+      </w:r>
+    </w:p>
+    <w:p>
+      <w:pPr>
+        <w:rPr>
+          <w:b/>
+          <w:bCs/>
+        </w:rPr>
+      </w:pPr>
+      <w:r>
+        <w:rPr>
+          <w:b/>
+          <w:bCs/>
+        </w:rPr>
+        <w:t>Associated Functional Requirements: FR11, FR12</w:t>
+      </w:r>
+    </w:p>
+    <w:p/>
+    <w:p>
+      <w:pPr>
+        <w:rPr>
+          <w:b/>
+          <w:bCs/>
+        </w:rPr>
+      </w:pPr>
+      <w:r>
+        <w:rPr>
+          <w:b/>
+          <w:bCs/>
+        </w:rPr>
+        <w:t>Preconditions</w:t>
+      </w:r>
+    </w:p>
+    <w:p>
+      <w:r>
+        <w:t>Test case and expected result have been identified.</w:t>
+      </w:r>
+    </w:p>
+    <w:p>
+      <w:r>
+        <w:t>Sandbox and mock system exist.</w:t>
+      </w:r>
+    </w:p>
+    <w:p/>
+    <w:p>
+      <w:pPr>
+        <w:rPr>
+          <w:b/>
+          <w:bCs/>
+        </w:rPr>
+      </w:pPr>
+      <w:r>
+        <w:rPr>
+          <w:b/>
+          <w:bCs/>
+        </w:rPr>
+        <w:t>Main Flow</w:t>
+      </w:r>
+    </w:p>
+    <w:p>
+      <w:r>
+        <w:t>Start test case by test harness.</w:t>
+      </w:r>
+    </w:p>
+    <w:p>
+      <w:r>
+        <w:t>Perform defined interaction by test harness.</w:t>
+      </w:r>
+    </w:p>
+    <w:p>
+      <w:r>
+        <w:t xml:space="preserve">Capture response/system </w:t>
+      </w:r>
+      <w:proofErr w:type="spellStart"/>
+      <w:r>
+        <w:t>behavior</w:t>
+      </w:r>
+      <w:proofErr w:type="spellEnd"/>
+      <w:r>
+        <w:t>.</w:t>
+      </w:r>
+    </w:p>
+    <w:p>
+      <w:r>
+        <w:t>Compare actual result with expected result.</w:t>
+      </w:r>
+    </w:p>
+    <w:p>
+      <w:r>
+        <w:t>Classify test as either PASSED or FAILED.</w:t>
+      </w:r>
+    </w:p>
+    <w:p>
+      <w:r>
+        <w:t>Log result of test.</w:t>
+      </w:r>
+    </w:p>
+    <w:p>
+      <w:r>
+        <w:t>If test is failed, log reason of failure.</w:t>
+      </w:r>
+    </w:p>
+    <w:p>
+      <w:pPr>
+        <w:rPr>
+          <w:b/>
+          <w:bCs/>
+        </w:rPr>
+      </w:pPr>
+    </w:p>
+    <w:p>
+      <w:pPr>
+        <w:rPr>
+          <w:b/>
+          <w:bCs/>
+        </w:rPr>
+      </w:pPr>
+      <w:r>
+        <w:rPr>
+          <w:b/>
+          <w:bCs/>
+        </w:rPr>
+        <w:t>Alternative/Exception Flows</w:t>
+      </w:r>
+    </w:p>
+    <w:p>
+      <w:r>
+        <w:t>If the expected response was not obtained, then classify test as failed.</w:t>
+      </w:r>
+    </w:p>
+    <w:p>
+      <w:r>
+        <w:t>If there is an unexpected system error, log this as the reason for test failure.</w:t>
+      </w:r>
+    </w:p>
+    <w:p>
+      <w:r>
+        <w:t>If there was a timeout, log test under timeout/failure.</w:t>
+      </w:r>
+    </w:p>
+    <w:p>
+      <w:pPr>
+        <w:rPr>
+          <w:b/>
+          <w:bCs/>
+        </w:rPr>
+      </w:pPr>
+    </w:p>
+    <w:p>
+      <w:pPr>
+        <w:rPr>
+          <w:b/>
+          <w:bCs/>
+        </w:rPr>
+      </w:pPr>
+      <w:r>
+        <w:rPr>
+          <w:b/>
+          <w:bCs/>
+        </w:rPr>
+        <w:t>Expected Result</w:t>
+      </w:r>
+    </w:p>
+    <w:p>
+      <w:r>
+        <w:t>All run tests are logged as passed or failed tests, and any failed tests have an identifiable reason.</w:t>
+      </w:r>
+      <w:r>
+        <w:br w:type="page"/>
+      </w:r>
+    </w:p>
+    <w:p>
+      <w:pPr>
+        <w:rPr>
+          <w:b/>
+          <w:bCs/>
+        </w:rPr>
+      </w:pPr>
+      <w:r>
+        <w:rPr>
+          <w:b/>
+          <w:bCs/>
+        </w:rPr>
+        <w:lastRenderedPageBreak/>
+        <w:t>UC-07: Create Automated Test Report</w:t>
+      </w:r>
+    </w:p>
+    <w:p/>
+    <w:p>
+      <w:r>
+        <w:rPr>
+          <w:b/>
+          <w:bCs/>
+        </w:rPr>
+        <w:t>Primary Actor</w:t>
+      </w:r>
+      <w:r>
+        <w:t>: Test Harness – Reporting Module</w:t>
+      </w:r>
+    </w:p>
+    <w:p>
+      <w:r>
+        <w:rPr>
+          <w:b/>
+          <w:bCs/>
+        </w:rPr>
+        <w:t>Goal</w:t>
+      </w:r>
+      <w:r>
+        <w:t>: Create a report outlining the result and coverage of the automated test.</w:t>
+      </w:r>
+    </w:p>
+    <w:p>
+      <w:pPr>
+        <w:rPr>
+          <w:b/>
+          <w:bCs/>
+        </w:rPr>
+      </w:pPr>
+      <w:r>
+        <w:rPr>
+          <w:b/>
+          <w:bCs/>
+        </w:rPr>
+        <w:t>Related Functional Requirements: FR13</w:t>
+      </w:r>
+    </w:p>
+    <w:p/>
+    <w:p>
+      <w:pPr>
+        <w:rPr>
+          <w:b/>
+          <w:bCs/>
+        </w:rPr>
+      </w:pPr>
+      <w:r>
+        <w:rPr>
+          <w:b/>
+          <w:bCs/>
+        </w:rPr>
+        <w:t>Preconditions</w:t>
+      </w:r>
+    </w:p>
+    <w:p>
+      <w:r>
+        <w:t>One or more automated tests have been completed.</w:t>
+      </w:r>
+    </w:p>
+    <w:p>
+      <w:r>
+        <w:t>Results from the tests can be accessed by the reporting module.</w:t>
+      </w:r>
+    </w:p>
+    <w:p>
+      <w:pPr>
+        <w:rPr>
+          <w:b/>
+          <w:bCs/>
+        </w:rPr>
+      </w:pPr>
+    </w:p>
+    <w:p>
+      <w:pPr>
+        <w:rPr>
+          <w:b/>
+          <w:bCs/>
+        </w:rPr>
+      </w:pPr>
+      <w:r>
+        <w:rPr>
+          <w:b/>
+          <w:bCs/>
+        </w:rPr>
+        <w:t>Main Flow</w:t>
+      </w:r>
+    </w:p>
+    <w:p>
+      <w:r>
+        <w:t>Result from the tests is obtained by the reporting module.</w:t>
+      </w:r>
+    </w:p>
+    <w:p>
+      <w:r>
+        <w:t>The number of total tests is counted.</w:t>
+      </w:r>
+    </w:p>
+    <w:p>
+      <w:r>
+        <w:t>Pass rate is counted.</w:t>
+      </w:r>
+    </w:p>
+    <w:p>
+      <w:r>
+        <w:t>Failures are categorized by severity level.</w:t>
+      </w:r>
+    </w:p>
+    <w:p>
+      <w:r>
+        <w:t>Coverage of resource and endpoints are collected.</w:t>
+      </w:r>
+    </w:p>
+    <w:p>
+      <w:r>
+        <w:t>Timestamp of the test is recorded.</w:t>
+      </w:r>
+    </w:p>
+    <w:p>
+      <w:r>
+        <w:t>Edge case results are mapped.</w:t>
+      </w:r>
+    </w:p>
+    <w:p>
+      <w:r>
+        <w:t>Expected and actual mapping results are logged.</w:t>
+      </w:r>
+    </w:p>
+    <w:p>
+      <w:r>
+        <w:t>The report is created.</w:t>
+      </w:r>
+    </w:p>
+    <w:p>
+      <w:r>
+        <w:t>Report is delivered as a testing/deployment artifact.</w:t>
+      </w:r>
+    </w:p>
+    <w:p>
+      <w:pPr>
+        <w:rPr>
+          <w:b/>
+          <w:bCs/>
+        </w:rPr>
+      </w:pPr>
+    </w:p>
+    <w:p>
+      <w:pPr>
+        <w:rPr>
+          <w:b/>
+          <w:bCs/>
+        </w:rPr>
+      </w:pPr>
+      <w:r>
+        <w:rPr>
+          <w:b/>
+          <w:bCs/>
+        </w:rPr>
+        <w:t>Expected Outcome</w:t>
+      </w:r>
+    </w:p>
+    <w:p>
+      <w:r>
+        <w:t>An automated test report is created that has enough information regarding the outcome of the test and individual test/coverage information.</w:t>
+      </w:r>
+    </w:p>
+    <w:p/>
+    <w:p/>
+    <w:p/>
+    <w:p/>
+    <w:p/>
+    <w:p>
+      <w:r>
+        <w:br w:type="page"/>
+      </w:r>
+    </w:p>
+    <w:p>
+      <w:pPr>
+        <w:pStyle w:val="Heading2"/>
+      </w:pPr>
+      <w:r>
+        <w:lastRenderedPageBreak/>
+        <w:t xml:space="preserve">4.4. Acceptance criteria for each use cases </w:t>
+      </w:r>
+    </w:p>
+    <w:p>
+      <w:r>
+        <w:rPr>
+          <w:noProof/>
+        </w:rPr>
+        <w:drawing>
+          <wp:inline distT="0" distB="0" distL="0" distR="0" wp14:anchorId="7E2B1CB2" wp14:editId="56F8C589">
+            <wp:extent cx="5731510" cy="5722620"/>
+            <wp:effectExtent l="0" t="0" r="0" b="5080"/>
+            <wp:docPr id="2100806392" name="Picture 1"/>
+            <wp:cNvGraphicFramePr>
+              <a:graphicFrameLocks xmlns:a="http://schemas.openxmlformats.org/drawingml/2006/main" noChangeAspect="1"/>
+            </wp:cNvGraphicFramePr>
+            <a:graphic xmlns:a="http://schemas.openxmlformats.org/drawingml/2006/main">
+              <a:graphicData uri="http://schemas.openxmlformats.org/drawingml/2006/picture">
+                <pic:pic xmlns:pic="http://schemas.openxmlformats.org/drawingml/2006/picture">
+                  <pic:nvPicPr>
+                    <pic:cNvPr id="2100806392" name="Picture 2100806392"/>
+                    <pic:cNvPicPr/>
+                  </pic:nvPicPr>
+                  <pic:blipFill>
+                    <a:blip r:embed="rId7">
+                      <a:extLst>
+                        <a:ext uri="{28A0092B-C50C-407E-A947-70E740481C1C}">
+                          <a14:useLocalDpi xmlns:a14="http://schemas.microsoft.com/office/drawing/2010/main" val="0"/>
+                        </a:ext>
+                      </a:extLst>
+                    </a:blip>
+                    <a:stretch>
+                      <a:fillRect/>
+                    </a:stretch>
+                  </pic:blipFill>
+                  <pic:spPr>
+                    <a:xfrm>
+                      <a:off x="0" y="0"/>
+                      <a:ext cx="5731510" cy="5722620"/>
+                    </a:xfrm>
+                    <a:prstGeom prst="rect">
+                      <a:avLst/>
+                    </a:prstGeom>
+                  </pic:spPr>
+                </pic:pic>
+              </a:graphicData>
+            </a:graphic>
+          </wp:inline>
+        </w:drawing>
+      </w:r>
+    </w:p>
+    <w:p/>
+    <w:p>
+      <w:pPr>
+        <w:spacing w:after="120"/>
+      </w:pPr>
+      <w:fldSimple w:instr=" ADDIN EN.REFLIST "/>
+    </w:p>
+    <w:p>
+      <w:pPr>
+        <w:pStyle w:val="Heading2"/>
       </w:pPr>
       <w:r>
         <w:rPr>
@@ -10178,7 +12492,7 @@
         </w:rPr>
         <w:t xml:space="preserve">. MedTalk AI. </w:t>
       </w:r>
-      <w:hyperlink r:id="rId7">
+      <w:hyperlink r:id="rId8">
         <w:r>
           <w:rPr>
             <w:rStyle w:val="Hyperlink"/>
@@ -10202,7 +12516,6 @@
           <w:i/>
           <w:iCs/>
         </w:rPr>
-        <w:lastRenderedPageBreak/>
         <w:t>National Clinical Terminology Service - National Clinical Terminology Service</w:t>
       </w:r>
       <w:r>
@@ -10211,7 +12524,7 @@
         </w:rPr>
         <w:t xml:space="preserve">. (2019, June 6). National Clinical Terminology Service. </w:t>
       </w:r>
-      <w:hyperlink r:id="rId8">
+      <w:hyperlink r:id="rId9">
         <w:r>
           <w:rPr>
             <w:rStyle w:val="Hyperlink"/>
@@ -10243,7 +12556,7 @@
         </w:rPr>
         <w:t xml:space="preserve">. (2026). FAZ Australia. </w:t>
       </w:r>
-      <w:hyperlink r:id="rId9">
+      <w:hyperlink r:id="rId10">
         <w:r>
           <w:rPr>
             <w:rStyle w:val="Hyperlink"/>
@@ -10256,6 +12569,18 @@
       <w:pPr>
         <w:spacing w:after="0"/>
       </w:pPr>
+      <w:r>
+        <w:t xml:space="preserve">FAZ Australia. (n.d.). </w:t>
+      </w:r>
+      <w:r>
+        <w:rPr>
+          <w:rStyle w:val="Emphasis"/>
+        </w:rPr>
+        <w:t xml:space="preserve">STARTE~1.DOC </w:t>
+      </w:r>
+      <w:r>
+        <w:t xml:space="preserve"> [Internal project document].</w:t>
+      </w:r>
     </w:p>
     <w:p>
       <w:pPr>
@@ -10324,7 +12649,6 @@
     </w:p>
     <w:p/>
     <w:sectPr>
-      <w:headerReference w:type="default" r:id="rId10"/>
       <w:pgSz w:w="11906" w:h="16838"/>
       <w:pgMar w:top="1440" w:right="1440" w:bottom="1440" w:left="1440" w:header="708" w:footer="708" w:gutter="0"/>
       <w:cols w:space="708"/>
@@ -10335,7 +12659,7 @@
 </file>
 
 <file path=word/endnotes.xml><?xml version="1.0" encoding="utf-8"?>
-<w:endnotes xmlns:wpc="http://schemas.microsoft.com/office/word/2010/wordprocessingCanvas" xmlns:cx="http://schemas.microsoft.com/office/drawing/2014/chartex" xmlns:cx1="http://schemas.microsoft.com/office/drawing/2015/9/8/chartex" xmlns:cx2="http://schemas.microsoft.com/office/drawing/2015/10/21/chartex" xmlns:cx3="http://schemas.microsoft.com/office/drawing/2016/5/9/chartex" xmlns:cx4="http://schemas.microsoft.com/office/drawing/2016/5/10/chartex" xmlns:cx5="http://schemas.microsoft.com/office/drawing/2016/5/11/chartex" xmlns:cx6="http://schemas.microsoft.com/office/drawing/2016/5/12/chartex" xmlns:cx7="http://schemas.microsoft.com/office/drawing/2016/5/13/chartex" xmlns:cx8="http://schemas.microsoft.com/office/drawing/2016/5/14/chartex" xmlns:mc="http://schemas.openxmlformats.org/markup-compatibility/2006" xmlns:aink="http://schemas.microsoft.com/office/drawing/2016/ink" xmlns:am3d="http://schemas.microsoft.com/office/drawing/2017/model3d" xmlns:o="urn:schemas-microsoft-com:office:office" xmlns:oel="http://schemas.microsoft.com/office/2019/extlst" xmlns:r="http://schemas.openxmlformats.org/officeDocument/2006/relationships" xmlns:m="http://schemas.openxmlformats.org/officeDocument/2006/math" xmlns:v="urn:schemas-microsoft-com:vml" xmlns:wp14="http://schemas.microsoft.com/office/word/2010/wordprocessingDrawing" xmlns:wp="http://schemas.openxmlformats.org/drawingml/2006/wordprocessingDrawing" xmlns:w10="urn:schemas-microsoft-com:office:word" xmlns:w="http://schemas.openxmlformats.org/wordprocessingml/2006/main" xmlns:w14="http://schemas.microsoft.com/office/word/2010/wordml" xmlns:w15="http://schemas.microsoft.com/office/word/2012/wordml" xmlns:w16cex="http://schemas.microsoft.com/office/word/2018/wordml/cex" xmlns:w16cid="http://schemas.microsoft.com/office/word/2016/wordml/cid" xmlns:w16="http://schemas.microsoft.com/office/word/2018/wordml" xmlns:w16du="http://schemas.microsoft.com/office/word/2023/wordml/word16du" xmlns:w16sdtdh="http://schemas.microsoft.com/office/word/2020/wordml/sdtdatahash" xmlns:w16sdtfl="http://schemas.microsoft.com/office/word/2024/wordml/sdtformatlock" xmlns:w16se="http://schemas.microsoft.com/office/word/2015/wordml/symex" xmlns:wpg="http://schemas.microsoft.com/office/word/2010/wordprocessingGroup" xmlns:wpi="http://schemas.microsoft.com/office/word/2010/wordprocessingInk" xmlns:wne="http://schemas.microsoft.com/office/word/2006/wordml" xmlns:wps="http://schemas.microsoft.com/office/word/2010/wordprocessingShape" mc:Ignorable="w14 w15 w16se w16cid w16 w16cex w16sdtdh w16sdtfl w16du wp14">
+<w:endnotes xmlns:wpc="http://schemas.microsoft.com/office/word/2010/wordprocessingCanvas" xmlns:cx="http://schemas.microsoft.com/office/drawing/2014/chartex" xmlns:cx1="http://schemas.microsoft.com/office/drawing/2015/9/8/chartex" xmlns:cx2="http://schemas.microsoft.com/office/drawing/2015/10/21/chartex" xmlns:cx3="http://schemas.microsoft.com/office/drawing/2016/5/9/chartex" xmlns:cx4="http://schemas.microsoft.com/office/drawing/2016/5/10/chartex" xmlns:cx5="http://schemas.microsoft.com/office/drawing/2016/5/11/chartex" xmlns:cx6="http://schemas.microsoft.com/office/drawing/2016/5/12/chartex" xmlns:cx7="http://schemas.microsoft.com/office/drawing/2016/5/13/chartex" xmlns:cx8="http://schemas.microsoft.com/office/drawing/2016/5/14/chartex" xmlns:mc="http://schemas.openxmlformats.org/markup-compatibility/2006" xmlns:m="http://schemas.openxmlformats.org/officeDocument/2006/math" xmlns:aink="http://schemas.microsoft.com/office/drawing/2016/ink" xmlns:am3d="http://schemas.microsoft.com/office/drawing/2017/model3d" xmlns:oel="http://schemas.microsoft.com/office/2019/extlst" xmlns:r="http://schemas.openxmlformats.org/officeDocument/2006/relationships" xmlns:wp14="http://schemas.microsoft.com/office/word/2010/wordprocessingDrawing" xmlns:wp="http://schemas.openxmlformats.org/drawingml/2006/wordprocessingDrawing" xmlns:wpg="http://schemas.microsoft.com/office/word/2010/wordprocessingGroup" xmlns:wpi="http://schemas.microsoft.com/office/word/2010/wordprocessingInk" xmlns:wps="http://schemas.microsoft.com/office/word/2010/wordprocessingShape" xmlns:o="urn:schemas-microsoft-com:office:office" xmlns:v="urn:schemas-microsoft-com:vml" xmlns:w10="urn:schemas-microsoft-com:office:word" xmlns:w="http://schemas.openxmlformats.org/wordprocessingml/2006/main" xmlns:w14="http://schemas.microsoft.com/office/word/2010/wordml" xmlns:w15="http://schemas.microsoft.com/office/word/2012/wordml" xmlns:w16cex="http://schemas.microsoft.com/office/word/2018/wordml/cex" xmlns:w16cid="http://schemas.microsoft.com/office/word/2016/wordml/cid" xmlns:w16="http://schemas.microsoft.com/office/word/2018/wordml" xmlns:w16sdtdh="http://schemas.microsoft.com/office/word/2020/wordml/sdtdatahash" xmlns:w16sdtfl="http://schemas.microsoft.com/office/word/2024/wordml/sdtformatlock" xmlns:w16se="http://schemas.microsoft.com/office/word/2015/wordml/symex" xmlns:w16du="http://schemas.microsoft.com/office/word/2023/wordml/word16du" xmlns:wne="http://schemas.microsoft.com/office/word/2006/wordml" mc:Ignorable="w14 w15 w16se w16cid w16 w16cex w16sdtdh w16sdtfl w16du wp14">
   <w:endnote w:type="separator" w:id="-1">
     <w:p>
       <w:pPr>
@@ -10360,7 +12684,7 @@
 </file>
 
 <file path=word/footnotes.xml><?xml version="1.0" encoding="utf-8"?>
-<w:footnotes xmlns:wpc="http://schemas.microsoft.com/office/word/2010/wordprocessingCanvas" xmlns:cx="http://schemas.microsoft.com/office/drawing/2014/chartex" xmlns:cx1="http://schemas.microsoft.com/office/drawing/2015/9/8/chartex" xmlns:cx2="http://schemas.microsoft.com/office/drawing/2015/10/21/chartex" xmlns:cx3="http://schemas.microsoft.com/office/drawing/2016/5/9/chartex" xmlns:cx4="http://schemas.microsoft.com/office/drawing/2016/5/10/chartex" xmlns:cx5="http://schemas.microsoft.com/office/drawing/2016/5/11/chartex" xmlns:cx6="http://schemas.microsoft.com/office/drawing/2016/5/12/chartex" xmlns:cx7="http://schemas.microsoft.com/office/drawing/2016/5/13/chartex" xmlns:cx8="http://schemas.microsoft.com/office/drawing/2016/5/14/chartex" xmlns:mc="http://schemas.openxmlformats.org/markup-compatibility/2006" xmlns:aink="http://schemas.microsoft.com/office/drawing/2016/ink" xmlns:am3d="http://schemas.microsoft.com/office/drawing/2017/model3d" xmlns:o="urn:schemas-microsoft-com:office:office" xmlns:oel="http://schemas.microsoft.com/office/2019/extlst" xmlns:r="http://schemas.openxmlformats.org/officeDocument/2006/relationships" xmlns:m="http://schemas.openxmlformats.org/officeDocument/2006/math" xmlns:v="urn:schemas-microsoft-com:vml" xmlns:wp14="http://schemas.microsoft.com/office/word/2010/wordprocessingDrawing" xmlns:wp="http://schemas.openxmlformats.org/drawingml/2006/wordprocessingDrawing" xmlns:w10="urn:schemas-microsoft-com:office:word" xmlns:w="http://schemas.openxmlformats.org/wordprocessingml/2006/main" xmlns:w14="http://schemas.microsoft.com/office/word/2010/wordml" xmlns:w15="http://schemas.microsoft.com/office/word/2012/wordml" xmlns:w16cex="http://schemas.microsoft.com/office/word/2018/wordml/cex" xmlns:w16cid="http://schemas.microsoft.com/office/word/2016/wordml/cid" xmlns:w16="http://schemas.microsoft.com/office/word/2018/wordml" xmlns:w16du="http://schemas.microsoft.com/office/word/2023/wordml/word16du" xmlns:w16sdtdh="http://schemas.microsoft.com/office/word/2020/wordml/sdtdatahash" xmlns:w16sdtfl="http://schemas.microsoft.com/office/word/2024/wordml/sdtformatlock" xmlns:w16se="http://schemas.microsoft.com/office/word/2015/wordml/symex" xmlns:wpg="http://schemas.microsoft.com/office/word/2010/wordprocessingGroup" xmlns:wpi="http://schemas.microsoft.com/office/word/2010/wordprocessingInk" xmlns:wne="http://schemas.microsoft.com/office/word/2006/wordml" xmlns:wps="http://schemas.microsoft.com/office/word/2010/wordprocessingShape" mc:Ignorable="w14 w15 w16se w16cid w16 w16cex w16sdtdh w16sdtfl w16du wp14">
+<w:footnotes xmlns:wpc="http://schemas.microsoft.com/office/word/2010/wordprocessingCanvas" xmlns:cx="http://schemas.microsoft.com/office/drawing/2014/chartex" xmlns:cx1="http://schemas.microsoft.com/office/drawing/2015/9/8/chartex" xmlns:cx2="http://schemas.microsoft.com/office/drawing/2015/10/21/chartex" xmlns:cx3="http://schemas.microsoft.com/office/drawing/2016/5/9/chartex" xmlns:cx4="http://schemas.microsoft.com/office/drawing/2016/5/10/chartex" xmlns:cx5="http://schemas.microsoft.com/office/drawing/2016/5/11/chartex" xmlns:cx6="http://schemas.microsoft.com/office/drawing/2016/5/12/chartex" xmlns:cx7="http://schemas.microsoft.com/office/drawing/2016/5/13/chartex" xmlns:cx8="http://schemas.microsoft.com/office/drawing/2016/5/14/chartex" xmlns:mc="http://schemas.openxmlformats.org/markup-compatibility/2006" xmlns:m="http://schemas.openxmlformats.org/officeDocument/2006/math" xmlns:aink="http://schemas.microsoft.com/office/drawing/2016/ink" xmlns:am3d="http://schemas.microsoft.com/office/drawing/2017/model3d" xmlns:oel="http://schemas.microsoft.com/office/2019/extlst" xmlns:r="http://schemas.openxmlformats.org/officeDocument/2006/relationships" xmlns:wp14="http://schemas.microsoft.com/office/word/2010/wordprocessingDrawing" xmlns:wp="http://schemas.openxmlformats.org/drawingml/2006/wordprocessingDrawing" xmlns:wpg="http://schemas.microsoft.com/office/word/2010/wordprocessingGroup" xmlns:wpi="http://schemas.microsoft.com/office/word/2010/wordprocessingInk" xmlns:wps="http://schemas.microsoft.com/office/word/2010/wordprocessingShape" xmlns:o="urn:schemas-microsoft-com:office:office" xmlns:v="urn:schemas-microsoft-com:vml" xmlns:w10="urn:schemas-microsoft-com:office:word" xmlns:w="http://schemas.openxmlformats.org/wordprocessingml/2006/main" xmlns:w14="http://schemas.microsoft.com/office/word/2010/wordml" xmlns:w15="http://schemas.microsoft.com/office/word/2012/wordml" xmlns:w16cex="http://schemas.microsoft.com/office/word/2018/wordml/cex" xmlns:w16cid="http://schemas.microsoft.com/office/word/2016/wordml/cid" xmlns:w16="http://schemas.microsoft.com/office/word/2018/wordml" xmlns:w16sdtdh="http://schemas.microsoft.com/office/word/2020/wordml/sdtdatahash" xmlns:w16sdtfl="http://schemas.microsoft.com/office/word/2024/wordml/sdtformatlock" xmlns:w16se="http://schemas.microsoft.com/office/word/2015/wordml/symex" xmlns:w16du="http://schemas.microsoft.com/office/word/2023/wordml/word16du" xmlns:wne="http://schemas.microsoft.com/office/word/2006/wordml" mc:Ignorable="w14 w15 w16se w16cid w16 w16cex w16sdtdh w16sdtfl w16du wp14">
   <w:footnote w:type="separator" w:id="-1">
     <w:p>
       <w:pPr>
@@ -10384,62 +12708,348 @@
 </w:footnotes>
 </file>
 
-<file path=word/header1.xml><?xml version="1.0" encoding="utf-8"?>
-<w:hdr xmlns:wpc="http://schemas.microsoft.com/office/word/2010/wordprocessingCanvas" xmlns:cx="http://schemas.microsoft.com/office/drawing/2014/chartex" xmlns:cx1="http://schemas.microsoft.com/office/drawing/2015/9/8/chartex" xmlns:cx2="http://schemas.microsoft.com/office/drawing/2015/10/21/chartex" xmlns:cx3="http://schemas.microsoft.com/office/drawing/2016/5/9/chartex" xmlns:cx4="http://schemas.microsoft.com/office/drawing/2016/5/10/chartex" xmlns:cx5="http://schemas.microsoft.com/office/drawing/2016/5/11/chartex" xmlns:cx6="http://schemas.microsoft.com/office/drawing/2016/5/12/chartex" xmlns:cx7="http://schemas.microsoft.com/office/drawing/2016/5/13/chartex" xmlns:cx8="http://schemas.microsoft.com/office/drawing/2016/5/14/chartex" xmlns:mc="http://schemas.openxmlformats.org/markup-compatibility/2006" xmlns:aink="http://schemas.microsoft.com/office/drawing/2016/ink" xmlns:am3d="http://schemas.microsoft.com/office/drawing/2017/model3d" xmlns:o="urn:schemas-microsoft-com:office:office" xmlns:oel="http://schemas.microsoft.com/office/2019/extlst" xmlns:r="http://schemas.openxmlformats.org/officeDocument/2006/relationships" xmlns:m="http://schemas.openxmlformats.org/officeDocument/2006/math" xmlns:v="urn:schemas-microsoft-com:vml" xmlns:wp14="http://schemas.microsoft.com/office/word/2010/wordprocessingDrawing" xmlns:wp="http://schemas.openxmlformats.org/drawingml/2006/wordprocessingDrawing" xmlns:w10="urn:schemas-microsoft-com:office:word" xmlns:w="http://schemas.openxmlformats.org/wordprocessingml/2006/main" xmlns:w14="http://schemas.microsoft.com/office/word/2010/wordml" xmlns:w15="http://schemas.microsoft.com/office/word/2012/wordml" xmlns:w16cex="http://schemas.microsoft.com/office/word/2018/wordml/cex" xmlns:w16cid="http://schemas.microsoft.com/office/word/2016/wordml/cid" xmlns:w16="http://schemas.microsoft.com/office/word/2018/wordml" xmlns:w16du="http://schemas.microsoft.com/office/word/2023/wordml/word16du" xmlns:w16sdtdh="http://schemas.microsoft.com/office/word/2020/wordml/sdtdatahash" xmlns:w16sdtfl="http://schemas.microsoft.com/office/word/2024/wordml/sdtformatlock" xmlns:w16se="http://schemas.microsoft.com/office/word/2015/wordml/symex" xmlns:wpg="http://schemas.microsoft.com/office/word/2010/wordprocessingGroup" xmlns:wpi="http://schemas.microsoft.com/office/word/2010/wordprocessingInk" xmlns:wne="http://schemas.microsoft.com/office/word/2006/wordml" xmlns:wps="http://schemas.microsoft.com/office/word/2010/wordprocessingShape" mc:Ignorable="w14 w15 w16se w16cid w16 w16cex w16sdtdh w16sdtfl w16du wp14">
-  <w:p>
-    <w:pPr>
-      <w:pStyle w:val="Header"/>
-    </w:pPr>
-    <w:r>
+<file path=word/numbering.xml><?xml version="1.0" encoding="utf-8"?>
+<w:numbering xmlns:wpc="http://schemas.microsoft.com/office/word/2010/wordprocessingCanvas" xmlns:cx="http://schemas.microsoft.com/office/drawing/2014/chartex" xmlns:cx1="http://schemas.microsoft.com/office/drawing/2015/9/8/chartex" xmlns:cx2="http://schemas.microsoft.com/office/drawing/2015/10/21/chartex" xmlns:cx3="http://schemas.microsoft.com/office/drawing/2016/5/9/chartex" xmlns:cx4="http://schemas.microsoft.com/office/drawing/2016/5/10/chartex" xmlns:cx5="http://schemas.microsoft.com/office/drawing/2016/5/11/chartex" xmlns:cx6="http://schemas.microsoft.com/office/drawing/2016/5/12/chartex" xmlns:cx7="http://schemas.microsoft.com/office/drawing/2016/5/13/chartex" xmlns:cx8="http://schemas.microsoft.com/office/drawing/2016/5/14/chartex" xmlns:mc="http://schemas.openxmlformats.org/markup-compatibility/2006" xmlns:m="http://schemas.openxmlformats.org/officeDocument/2006/math" xmlns:aink="http://schemas.microsoft.com/office/drawing/2016/ink" xmlns:am3d="http://schemas.microsoft.com/office/drawing/2017/model3d" xmlns:oel="http://schemas.microsoft.com/office/2019/extlst" xmlns:r="http://schemas.openxmlformats.org/officeDocument/2006/relationships" xmlns:wp14="http://schemas.microsoft.com/office/word/2010/wordprocessingDrawing" xmlns:wp="http://schemas.openxmlformats.org/drawingml/2006/wordprocessingDrawing" xmlns:wpg="http://schemas.microsoft.com/office/word/2010/wordprocessingGroup" xmlns:wpi="http://schemas.microsoft.com/office/word/2010/wordprocessingInk" xmlns:wps="http://schemas.microsoft.com/office/word/2010/wordprocessingShape" xmlns:o="urn:schemas-microsoft-com:office:office" xmlns:v="urn:schemas-microsoft-com:vml" xmlns:w10="urn:schemas-microsoft-com:office:word" xmlns:w="http://schemas.openxmlformats.org/wordprocessingml/2006/main" xmlns:w14="http://schemas.microsoft.com/office/word/2010/wordml" xmlns:w15="http://schemas.microsoft.com/office/word/2012/wordml" xmlns:w16cex="http://schemas.microsoft.com/office/word/2018/wordml/cex" xmlns:w16cid="http://schemas.microsoft.com/office/word/2016/wordml/cid" xmlns:w16="http://schemas.microsoft.com/office/word/2018/wordml" xmlns:w16sdtdh="http://schemas.microsoft.com/office/word/2020/wordml/sdtdatahash" xmlns:w16sdtfl="http://schemas.microsoft.com/office/word/2024/wordml/sdtformatlock" xmlns:w16se="http://schemas.microsoft.com/office/word/2015/wordml/symex" xmlns:w16du="http://schemas.microsoft.com/office/word/2023/wordml/word16du" xmlns:wne="http://schemas.microsoft.com/office/word/2006/wordml" mc:Ignorable="w14 w15 w16se w16cid w16 w16cex w16sdtdh w16sdtfl w16du wp14">
+  <w:abstractNum w:abstractNumId="0" w15:restartNumberingAfterBreak="0">
+    <w:nsid w:val="376A1AFA"/>
+    <w:multiLevelType w:val="hybridMultilevel"/>
+    <w:tmpl w:val="54DAB2A8"/>
+    <w:lvl w:ilvl="0" w:tplc="08090001">
+      <w:start w:val="1"/>
+      <w:numFmt w:val="bullet"/>
+      <w:lvlText w:val=""/>
+      <w:lvlJc w:val="left"/>
+      <w:pPr>
+        <w:ind w:left="720" w:hanging="360"/>
+      </w:pPr>
       <w:rPr>
-        <w:noProof/>
+        <w:rFonts w:ascii="Symbol" w:hAnsi="Symbol" w:hint="default"/>
       </w:rPr>
-      <w:drawing>
-        <wp:inline distT="0" distB="0" distL="0" distR="0" wp14:anchorId="629277E7" wp14:editId="2A7F3A14">
-          <wp:extent cx="922020" cy="670241"/>
-          <wp:effectExtent l="0" t="0" r="0" b="0"/>
-          <wp:docPr id="561118324" name="Picture 4" descr="A blue and white logo&#10;&#10;AI-generated content may be incorrect."/>
-          <wp:cNvGraphicFramePr/>
-          <a:graphic xmlns:a="http://schemas.openxmlformats.org/drawingml/2006/main">
-            <a:graphicData uri="http://schemas.openxmlformats.org/drawingml/2006/picture">
-              <pic:pic xmlns:pic="http://schemas.openxmlformats.org/drawingml/2006/picture">
-                <pic:nvPicPr>
-                  <pic:cNvPr id="0" name=""/>
-                  <pic:cNvPicPr/>
-                </pic:nvPicPr>
-                <pic:blipFill>
-                  <a:blip r:embed="rId1"/>
-                  <a:stretch>
-                    <a:fillRect/>
-                  </a:stretch>
-                </pic:blipFill>
-                <pic:spPr>
-                  <a:xfrm>
-                    <a:off x="0" y="0"/>
-                    <a:ext cx="932741" cy="678035"/>
-                  </a:xfrm>
-                  <a:prstGeom prst="rect">
-                    <a:avLst/>
-                  </a:prstGeom>
-                  <a:noFill/>
-                  <a:ln>
-                    <a:noFill/>
-                    <a:prstDash/>
-                  </a:ln>
-                </pic:spPr>
-              </pic:pic>
-            </a:graphicData>
-          </a:graphic>
-        </wp:inline>
-      </w:drawing>
-    </w:r>
-  </w:p>
-</w:hdr>
-</file>
-
-<file path=word/numbering.xml><?xml version="1.0" encoding="utf-8"?>
-<w:numbering xmlns:wpc="http://schemas.microsoft.com/office/word/2010/wordprocessingCanvas" xmlns:cx="http://schemas.microsoft.com/office/drawing/2014/chartex" xmlns:cx1="http://schemas.microsoft.com/office/drawing/2015/9/8/chartex" xmlns:cx2="http://schemas.microsoft.com/office/drawing/2015/10/21/chartex" xmlns:cx3="http://schemas.microsoft.com/office/drawing/2016/5/9/chartex" xmlns:cx4="http://schemas.microsoft.com/office/drawing/2016/5/10/chartex" xmlns:cx5="http://schemas.microsoft.com/office/drawing/2016/5/11/chartex" xmlns:cx6="http://schemas.microsoft.com/office/drawing/2016/5/12/chartex" xmlns:cx7="http://schemas.microsoft.com/office/drawing/2016/5/13/chartex" xmlns:cx8="http://schemas.microsoft.com/office/drawing/2016/5/14/chartex" xmlns:mc="http://schemas.openxmlformats.org/markup-compatibility/2006" xmlns:aink="http://schemas.microsoft.com/office/drawing/2016/ink" xmlns:am3d="http://schemas.microsoft.com/office/drawing/2017/model3d" xmlns:o="urn:schemas-microsoft-com:office:office" xmlns:oel="http://schemas.microsoft.com/office/2019/extlst" xmlns:r="http://schemas.openxmlformats.org/officeDocument/2006/relationships" xmlns:m="http://schemas.openxmlformats.org/officeDocument/2006/math" xmlns:v="urn:schemas-microsoft-com:vml" xmlns:wp14="http://schemas.microsoft.com/office/word/2010/wordprocessingDrawing" xmlns:wp="http://schemas.openxmlformats.org/drawingml/2006/wordprocessingDrawing" xmlns:w10="urn:schemas-microsoft-com:office:word" xmlns:w="http://schemas.openxmlformats.org/wordprocessingml/2006/main" xmlns:w14="http://schemas.microsoft.com/office/word/2010/wordml" xmlns:w15="http://schemas.microsoft.com/office/word/2012/wordml" xmlns:w16cex="http://schemas.microsoft.com/office/word/2018/wordml/cex" xmlns:w16cid="http://schemas.microsoft.com/office/word/2016/wordml/cid" xmlns:w16="http://schemas.microsoft.com/office/word/2018/wordml" xmlns:w16du="http://schemas.microsoft.com/office/word/2023/wordml/word16du" xmlns:w16sdtdh="http://schemas.microsoft.com/office/word/2020/wordml/sdtdatahash" xmlns:w16sdtfl="http://schemas.microsoft.com/office/word/2024/wordml/sdtformatlock" xmlns:w16se="http://schemas.microsoft.com/office/word/2015/wordml/symex" xmlns:wpg="http://schemas.microsoft.com/office/word/2010/wordprocessingGroup" xmlns:wpi="http://schemas.microsoft.com/office/word/2010/wordprocessingInk" xmlns:wne="http://schemas.microsoft.com/office/word/2006/wordml" xmlns:wps="http://schemas.microsoft.com/office/word/2010/wordprocessingShape" mc:Ignorable="w14 w15 w16se w16cid w16 w16cex w16sdtdh w16sdtfl w16du wp14">
-  <w:abstractNum w:abstractNumId="0" w15:restartNumberingAfterBreak="0">
+    </w:lvl>
+    <w:lvl w:ilvl="1" w:tplc="08090003" w:tentative="1">
+      <w:start w:val="1"/>
+      <w:numFmt w:val="bullet"/>
+      <w:lvlText w:val="o"/>
+      <w:lvlJc w:val="left"/>
+      <w:pPr>
+        <w:ind w:left="1440" w:hanging="360"/>
+      </w:pPr>
+      <w:rPr>
+        <w:rFonts w:ascii="Courier New" w:hAnsi="Courier New" w:hint="default"/>
+      </w:rPr>
+    </w:lvl>
+    <w:lvl w:ilvl="2" w:tplc="08090005" w:tentative="1">
+      <w:start w:val="1"/>
+      <w:numFmt w:val="bullet"/>
+      <w:lvlText w:val=""/>
+      <w:lvlJc w:val="left"/>
+      <w:pPr>
+        <w:ind w:left="2160" w:hanging="360"/>
+      </w:pPr>
+      <w:rPr>
+        <w:rFonts w:ascii="Wingdings" w:hAnsi="Wingdings" w:hint="default"/>
+      </w:rPr>
+    </w:lvl>
+    <w:lvl w:ilvl="3" w:tplc="08090001" w:tentative="1">
+      <w:start w:val="1"/>
+      <w:numFmt w:val="bullet"/>
+      <w:lvlText w:val=""/>
+      <w:lvlJc w:val="left"/>
+      <w:pPr>
+        <w:ind w:left="2880" w:hanging="360"/>
+      </w:pPr>
+      <w:rPr>
+        <w:rFonts w:ascii="Symbol" w:hAnsi="Symbol" w:hint="default"/>
+      </w:rPr>
+    </w:lvl>
+    <w:lvl w:ilvl="4" w:tplc="08090003" w:tentative="1">
+      <w:start w:val="1"/>
+      <w:numFmt w:val="bullet"/>
+      <w:lvlText w:val="o"/>
+      <w:lvlJc w:val="left"/>
+      <w:pPr>
+        <w:ind w:left="3600" w:hanging="360"/>
+      </w:pPr>
+      <w:rPr>
+        <w:rFonts w:ascii="Courier New" w:hAnsi="Courier New" w:hint="default"/>
+      </w:rPr>
+    </w:lvl>
+    <w:lvl w:ilvl="5" w:tplc="08090005" w:tentative="1">
+      <w:start w:val="1"/>
+      <w:numFmt w:val="bullet"/>
+      <w:lvlText w:val=""/>
+      <w:lvlJc w:val="left"/>
+      <w:pPr>
+        <w:ind w:left="4320" w:hanging="360"/>
+      </w:pPr>
+      <w:rPr>
+        <w:rFonts w:ascii="Wingdings" w:hAnsi="Wingdings" w:hint="default"/>
+      </w:rPr>
+    </w:lvl>
+    <w:lvl w:ilvl="6" w:tplc="08090001" w:tentative="1">
+      <w:start w:val="1"/>
+      <w:numFmt w:val="bullet"/>
+      <w:lvlText w:val=""/>
+      <w:lvlJc w:val="left"/>
+      <w:pPr>
+        <w:ind w:left="5040" w:hanging="360"/>
+      </w:pPr>
+      <w:rPr>
+        <w:rFonts w:ascii="Symbol" w:hAnsi="Symbol" w:hint="default"/>
+      </w:rPr>
+    </w:lvl>
+    <w:lvl w:ilvl="7" w:tplc="08090003" w:tentative="1">
+      <w:start w:val="1"/>
+      <w:numFmt w:val="bullet"/>
+      <w:lvlText w:val="o"/>
+      <w:lvlJc w:val="left"/>
+      <w:pPr>
+        <w:ind w:left="5760" w:hanging="360"/>
+      </w:pPr>
+      <w:rPr>
+        <w:rFonts w:ascii="Courier New" w:hAnsi="Courier New" w:hint="default"/>
+      </w:rPr>
+    </w:lvl>
+    <w:lvl w:ilvl="8" w:tplc="08090005" w:tentative="1">
+      <w:start w:val="1"/>
+      <w:numFmt w:val="bullet"/>
+      <w:lvlText w:val=""/>
+      <w:lvlJc w:val="left"/>
+      <w:pPr>
+        <w:ind w:left="6480" w:hanging="360"/>
+      </w:pPr>
+      <w:rPr>
+        <w:rFonts w:ascii="Wingdings" w:hAnsi="Wingdings" w:hint="default"/>
+      </w:rPr>
+    </w:lvl>
+  </w:abstractNum>
+  <w:abstractNum w:abstractNumId="1" w15:restartNumberingAfterBreak="0">
+    <w:nsid w:val="55543EB4"/>
+    <w:multiLevelType w:val="hybridMultilevel"/>
+    <w:tmpl w:val="880A7B68"/>
+    <w:lvl w:ilvl="0" w:tplc="08090001">
+      <w:start w:val="1"/>
+      <w:numFmt w:val="bullet"/>
+      <w:lvlText w:val=""/>
+      <w:lvlJc w:val="left"/>
+      <w:pPr>
+        <w:ind w:left="720" w:hanging="360"/>
+      </w:pPr>
+      <w:rPr>
+        <w:rFonts w:ascii="Symbol" w:hAnsi="Symbol" w:hint="default"/>
+      </w:rPr>
+    </w:lvl>
+    <w:lvl w:ilvl="1" w:tplc="08090003" w:tentative="1">
+      <w:start w:val="1"/>
+      <w:numFmt w:val="bullet"/>
+      <w:lvlText w:val="o"/>
+      <w:lvlJc w:val="left"/>
+      <w:pPr>
+        <w:ind w:left="1440" w:hanging="360"/>
+      </w:pPr>
+      <w:rPr>
+        <w:rFonts w:ascii="Courier New" w:hAnsi="Courier New" w:hint="default"/>
+      </w:rPr>
+    </w:lvl>
+    <w:lvl w:ilvl="2" w:tplc="08090005" w:tentative="1">
+      <w:start w:val="1"/>
+      <w:numFmt w:val="bullet"/>
+      <w:lvlText w:val=""/>
+      <w:lvlJc w:val="left"/>
+      <w:pPr>
+        <w:ind w:left="2160" w:hanging="360"/>
+      </w:pPr>
+      <w:rPr>
+        <w:rFonts w:ascii="Wingdings" w:hAnsi="Wingdings" w:hint="default"/>
+      </w:rPr>
+    </w:lvl>
+    <w:lvl w:ilvl="3" w:tplc="08090001" w:tentative="1">
+      <w:start w:val="1"/>
+      <w:numFmt w:val="bullet"/>
+      <w:lvlText w:val=""/>
+      <w:lvlJc w:val="left"/>
+      <w:pPr>
+        <w:ind w:left="2880" w:hanging="360"/>
+      </w:pPr>
+      <w:rPr>
+        <w:rFonts w:ascii="Symbol" w:hAnsi="Symbol" w:hint="default"/>
+      </w:rPr>
+    </w:lvl>
+    <w:lvl w:ilvl="4" w:tplc="08090003" w:tentative="1">
+      <w:start w:val="1"/>
+      <w:numFmt w:val="bullet"/>
+      <w:lvlText w:val="o"/>
+      <w:lvlJc w:val="left"/>
+      <w:pPr>
+        <w:ind w:left="3600" w:hanging="360"/>
+      </w:pPr>
+      <w:rPr>
+        <w:rFonts w:ascii="Courier New" w:hAnsi="Courier New" w:hint="default"/>
+      </w:rPr>
+    </w:lvl>
+    <w:lvl w:ilvl="5" w:tplc="08090005" w:tentative="1">
+      <w:start w:val="1"/>
+      <w:numFmt w:val="bullet"/>
+      <w:lvlText w:val=""/>
+      <w:lvlJc w:val="left"/>
+      <w:pPr>
+        <w:ind w:left="4320" w:hanging="360"/>
+      </w:pPr>
+      <w:rPr>
+        <w:rFonts w:ascii="Wingdings" w:hAnsi="Wingdings" w:hint="default"/>
+      </w:rPr>
+    </w:lvl>
+    <w:lvl w:ilvl="6" w:tplc="08090001" w:tentative="1">
+      <w:start w:val="1"/>
+      <w:numFmt w:val="bullet"/>
+      <w:lvlText w:val=""/>
+      <w:lvlJc w:val="left"/>
+      <w:pPr>
+        <w:ind w:left="5040" w:hanging="360"/>
+      </w:pPr>
+      <w:rPr>
+        <w:rFonts w:ascii="Symbol" w:hAnsi="Symbol" w:hint="default"/>
+      </w:rPr>
+    </w:lvl>
+    <w:lvl w:ilvl="7" w:tplc="08090003" w:tentative="1">
+      <w:start w:val="1"/>
+      <w:numFmt w:val="bullet"/>
+      <w:lvlText w:val="o"/>
+      <w:lvlJc w:val="left"/>
+      <w:pPr>
+        <w:ind w:left="5760" w:hanging="360"/>
+      </w:pPr>
+      <w:rPr>
+        <w:rFonts w:ascii="Courier New" w:hAnsi="Courier New" w:hint="default"/>
+      </w:rPr>
+    </w:lvl>
+    <w:lvl w:ilvl="8" w:tplc="08090005" w:tentative="1">
+      <w:start w:val="1"/>
+      <w:numFmt w:val="bullet"/>
+      <w:lvlText w:val=""/>
+      <w:lvlJc w:val="left"/>
+      <w:pPr>
+        <w:ind w:left="6480" w:hanging="360"/>
+      </w:pPr>
+      <w:rPr>
+        <w:rFonts w:ascii="Wingdings" w:hAnsi="Wingdings" w:hint="default"/>
+      </w:rPr>
+    </w:lvl>
+  </w:abstractNum>
+  <w:abstractNum w:abstractNumId="2" w15:restartNumberingAfterBreak="0">
+    <w:nsid w:val="6D367050"/>
+    <w:multiLevelType w:val="hybridMultilevel"/>
+    <w:tmpl w:val="05CEFB78"/>
+    <w:lvl w:ilvl="0" w:tplc="08090001">
+      <w:start w:val="1"/>
+      <w:numFmt w:val="bullet"/>
+      <w:lvlText w:val=""/>
+      <w:lvlJc w:val="left"/>
+      <w:pPr>
+        <w:ind w:left="720" w:hanging="360"/>
+      </w:pPr>
+      <w:rPr>
+        <w:rFonts w:ascii="Symbol" w:hAnsi="Symbol" w:hint="default"/>
+      </w:rPr>
+    </w:lvl>
+    <w:lvl w:ilvl="1" w:tplc="08090003" w:tentative="1">
+      <w:start w:val="1"/>
+      <w:numFmt w:val="bullet"/>
+      <w:lvlText w:val="o"/>
+      <w:lvlJc w:val="left"/>
+      <w:pPr>
+        <w:ind w:left="1440" w:hanging="360"/>
+      </w:pPr>
+      <w:rPr>
+        <w:rFonts w:ascii="Courier New" w:hAnsi="Courier New" w:hint="default"/>
+      </w:rPr>
+    </w:lvl>
+    <w:lvl w:ilvl="2" w:tplc="08090005" w:tentative="1">
+      <w:start w:val="1"/>
+      <w:numFmt w:val="bullet"/>
+      <w:lvlText w:val=""/>
+      <w:lvlJc w:val="left"/>
+      <w:pPr>
+        <w:ind w:left="2160" w:hanging="360"/>
+      </w:pPr>
+      <w:rPr>
+        <w:rFonts w:ascii="Wingdings" w:hAnsi="Wingdings" w:hint="default"/>
+      </w:rPr>
+    </w:lvl>
+    <w:lvl w:ilvl="3" w:tplc="08090001" w:tentative="1">
+      <w:start w:val="1"/>
+      <w:numFmt w:val="bullet"/>
+      <w:lvlText w:val=""/>
+      <w:lvlJc w:val="left"/>
+      <w:pPr>
+        <w:ind w:left="2880" w:hanging="360"/>
+      </w:pPr>
+      <w:rPr>
+        <w:rFonts w:ascii="Symbol" w:hAnsi="Symbol" w:hint="default"/>
+      </w:rPr>
+    </w:lvl>
+    <w:lvl w:ilvl="4" w:tplc="08090003" w:tentative="1">
+      <w:start w:val="1"/>
+      <w:numFmt w:val="bullet"/>
+      <w:lvlText w:val="o"/>
+      <w:lvlJc w:val="left"/>
+      <w:pPr>
+        <w:ind w:left="3600" w:hanging="360"/>
+      </w:pPr>
+      <w:rPr>
+        <w:rFonts w:ascii="Courier New" w:hAnsi="Courier New" w:hint="default"/>
+      </w:rPr>
+    </w:lvl>
+    <w:lvl w:ilvl="5" w:tplc="08090005" w:tentative="1">
+      <w:start w:val="1"/>
+      <w:numFmt w:val="bullet"/>
+      <w:lvlText w:val=""/>
+      <w:lvlJc w:val="left"/>
+      <w:pPr>
+        <w:ind w:left="4320" w:hanging="360"/>
+      </w:pPr>
+      <w:rPr>
+        <w:rFonts w:ascii="Wingdings" w:hAnsi="Wingdings" w:hint="default"/>
+      </w:rPr>
+    </w:lvl>
+    <w:lvl w:ilvl="6" w:tplc="08090001" w:tentative="1">
+      <w:start w:val="1"/>
+      <w:numFmt w:val="bullet"/>
+      <w:lvlText w:val=""/>
+      <w:lvlJc w:val="left"/>
+      <w:pPr>
+        <w:ind w:left="5040" w:hanging="360"/>
+      </w:pPr>
+      <w:rPr>
+        <w:rFonts w:ascii="Symbol" w:hAnsi="Symbol" w:hint="default"/>
+      </w:rPr>
+    </w:lvl>
+    <w:lvl w:ilvl="7" w:tplc="08090003" w:tentative="1">
+      <w:start w:val="1"/>
+      <w:numFmt w:val="bullet"/>
+      <w:lvlText w:val="o"/>
+      <w:lvlJc w:val="left"/>
+      <w:pPr>
+        <w:ind w:left="5760" w:hanging="360"/>
+      </w:pPr>
+      <w:rPr>
+        <w:rFonts w:ascii="Courier New" w:hAnsi="Courier New" w:hint="default"/>
+      </w:rPr>
+    </w:lvl>
+    <w:lvl w:ilvl="8" w:tplc="08090005" w:tentative="1">
+      <w:start w:val="1"/>
+      <w:numFmt w:val="bullet"/>
+      <w:lvlText w:val=""/>
+      <w:lvlJc w:val="left"/>
+      <w:pPr>
+        <w:ind w:left="6480" w:hanging="360"/>
+      </w:pPr>
+      <w:rPr>
+        <w:rFonts w:ascii="Wingdings" w:hAnsi="Wingdings" w:hint="default"/>
+      </w:rPr>
+    </w:lvl>
+  </w:abstractNum>
+  <w:abstractNum w:abstractNumId="3" w15:restartNumberingAfterBreak="0">
     <w:nsid w:val="7852D037"/>
     <w:multiLevelType w:val="hybridMultilevel"/>
     <w:tmpl w:val="F43A1892"/>
@@ -10526,13 +13136,22 @@
     </w:lvl>
   </w:abstractNum>
   <w:num w:numId="1" w16cid:durableId="375550706">
+    <w:abstractNumId w:val="3"/>
+  </w:num>
+  <w:num w:numId="2" w16cid:durableId="412551155">
     <w:abstractNumId w:val="0"/>
+  </w:num>
+  <w:num w:numId="3" w16cid:durableId="2069301550">
+    <w:abstractNumId w:val="2"/>
+  </w:num>
+  <w:num w:numId="4" w16cid:durableId="1492333399">
+    <w:abstractNumId w:val="1"/>
   </w:num>
 </w:numbering>
 </file>
 
 <file path=word/styles.xml><?xml version="1.0" encoding="utf-8"?>
-<w:styles xmlns:mc="http://schemas.openxmlformats.org/markup-compatibility/2006" xmlns:r="http://schemas.openxmlformats.org/officeDocument/2006/relationships" xmlns:w="http://schemas.openxmlformats.org/wordprocessingml/2006/main" xmlns:w14="http://schemas.microsoft.com/office/word/2010/wordml" xmlns:w15="http://schemas.microsoft.com/office/word/2012/wordml" xmlns:w16cex="http://schemas.microsoft.com/office/word/2018/wordml/cex" xmlns:w16cid="http://schemas.microsoft.com/office/word/2016/wordml/cid" xmlns:w16="http://schemas.microsoft.com/office/word/2018/wordml" xmlns:w16du="http://schemas.microsoft.com/office/word/2023/wordml/word16du" xmlns:w16sdtdh="http://schemas.microsoft.com/office/word/2020/wordml/sdtdatahash" xmlns:w16sdtfl="http://schemas.microsoft.com/office/word/2024/wordml/sdtformatlock" xmlns:w16se="http://schemas.microsoft.com/office/word/2015/wordml/symex" mc:Ignorable="w14 w15 w16se w16cid w16 w16cex w16sdtdh w16sdtfl w16du">
+<w:styles xmlns:mc="http://schemas.openxmlformats.org/markup-compatibility/2006" xmlns:r="http://schemas.openxmlformats.org/officeDocument/2006/relationships" xmlns:w="http://schemas.openxmlformats.org/wordprocessingml/2006/main" xmlns:w14="http://schemas.microsoft.com/office/word/2010/wordml" xmlns:w15="http://schemas.microsoft.com/office/word/2012/wordml" xmlns:w16cex="http://schemas.microsoft.com/office/word/2018/wordml/cex" xmlns:w16cid="http://schemas.microsoft.com/office/word/2016/wordml/cid" xmlns:w16="http://schemas.microsoft.com/office/word/2018/wordml" xmlns:w16sdtdh="http://schemas.microsoft.com/office/word/2020/wordml/sdtdatahash" xmlns:w16sdtfl="http://schemas.microsoft.com/office/word/2024/wordml/sdtformatlock" xmlns:w16se="http://schemas.microsoft.com/office/word/2015/wordml/symex" xmlns:w16du="http://schemas.microsoft.com/office/word/2023/wordml/word16du" mc:Ignorable="w14 w15 w16se w16cid w16 w16cex w16sdtdh w16sdtfl w16du">
   <w:docDefaults>
     <w:rPrDefault>
       <w:rPr>
@@ -10982,7 +13601,6 @@
     <w:next w:val="Normal"/>
     <w:link w:val="Heading3Char"/>
     <w:uiPriority w:val="9"/>
-    <w:semiHidden/>
     <w:unhideWhenUsed/>
     <w:qFormat/>
     <w:rsid w:val="00446F43"/>
@@ -11189,7 +13807,6 @@
     <w:basedOn w:val="DefaultParagraphFont"/>
     <w:link w:val="Heading3"/>
     <w:uiPriority w:val="9"/>
-    <w:semiHidden/>
     <w:rsid w:val="00446F43"/>
     <w:rPr>
       <w:rFonts w:eastAsiaTheme="majorEastAsia" w:cstheme="majorBidi"/>
@@ -12043,6 +14660,118 @@
       <w:u w:val="single"/>
     </w:rPr>
   </w:style>
+  <w:style w:type="table" w:styleId="GridTable1Light-Accent1">
+    <w:name w:val="Grid Table 1 Light Accent 1"/>
+    <w:basedOn w:val="TableNormal"/>
+    <w:uiPriority w:val="46"/>
+    <w:rsid w:val="00282DA8"/>
+    <w:pPr>
+      <w:spacing w:after="0" w:line="240" w:lineRule="auto"/>
+    </w:pPr>
+    <w:tblPr>
+      <w:tblStyleRowBandSize w:val="1"/>
+      <w:tblStyleColBandSize w:val="1"/>
+      <w:tblBorders>
+        <w:top w:val="single" w:sz="4" w:space="0" w:color="83CAEB" w:themeColor="accent1" w:themeTint="66"/>
+        <w:left w:val="single" w:sz="4" w:space="0" w:color="83CAEB" w:themeColor="accent1" w:themeTint="66"/>
+        <w:bottom w:val="single" w:sz="4" w:space="0" w:color="83CAEB" w:themeColor="accent1" w:themeTint="66"/>
+        <w:right w:val="single" w:sz="4" w:space="0" w:color="83CAEB" w:themeColor="accent1" w:themeTint="66"/>
+        <w:insideH w:val="single" w:sz="4" w:space="0" w:color="83CAEB" w:themeColor="accent1" w:themeTint="66"/>
+        <w:insideV w:val="single" w:sz="4" w:space="0" w:color="83CAEB" w:themeColor="accent1" w:themeTint="66"/>
+      </w:tblBorders>
+    </w:tblPr>
+    <w:tblStylePr w:type="firstRow">
+      <w:rPr>
+        <w:b/>
+        <w:bCs/>
+      </w:rPr>
+      <w:tblPr/>
+      <w:tcPr>
+        <w:tcBorders>
+          <w:bottom w:val="single" w:sz="12" w:space="0" w:color="45B0E1" w:themeColor="accent1" w:themeTint="99"/>
+        </w:tcBorders>
+      </w:tcPr>
+    </w:tblStylePr>
+    <w:tblStylePr w:type="lastRow">
+      <w:rPr>
+        <w:b/>
+        <w:bCs/>
+      </w:rPr>
+      <w:tblPr/>
+      <w:tcPr>
+        <w:tcBorders>
+          <w:top w:val="double" w:sz="2" w:space="0" w:color="45B0E1" w:themeColor="accent1" w:themeTint="99"/>
+        </w:tcBorders>
+      </w:tcPr>
+    </w:tblStylePr>
+    <w:tblStylePr w:type="firstCol">
+      <w:rPr>
+        <w:b/>
+        <w:bCs/>
+      </w:rPr>
+    </w:tblStylePr>
+    <w:tblStylePr w:type="lastCol">
+      <w:rPr>
+        <w:b/>
+        <w:bCs/>
+      </w:rPr>
+    </w:tblStylePr>
+  </w:style>
+  <w:style w:type="paragraph" w:styleId="z-BottomofForm">
+    <w:name w:val="HTML Bottom of Form"/>
+    <w:basedOn w:val="Normal"/>
+    <w:next w:val="Normal"/>
+    <w:link w:val="z-BottomofFormChar"/>
+    <w:hidden/>
+    <w:uiPriority w:val="99"/>
+    <w:semiHidden/>
+    <w:unhideWhenUsed/>
+    <w:rsid w:val="00E170C7"/>
+    <w:pPr>
+      <w:pBdr>
+        <w:top w:val="single" w:sz="6" w:space="1" w:color="auto"/>
+      </w:pBdr>
+      <w:spacing w:after="0" w:line="240" w:lineRule="auto"/>
+      <w:jc w:val="center"/>
+    </w:pPr>
+    <w:rPr>
+      <w:rFonts w:ascii="Arial" w:eastAsia="Times New Roman" w:hAnsi="Arial" w:cs="Arial"/>
+      <w:vanish/>
+      <w:kern w:val="0"/>
+      <w:sz w:val="16"/>
+      <w:szCs w:val="16"/>
+      <w:lang w:val="en-GB" w:eastAsia="en-GB"/>
+      <w14:ligatures w14:val="none"/>
+    </w:rPr>
+  </w:style>
+  <w:style w:type="character" w:customStyle="1" w:styleId="z-BottomofFormChar">
+    <w:name w:val="z-Bottom of Form Char"/>
+    <w:basedOn w:val="DefaultParagraphFont"/>
+    <w:link w:val="z-BottomofForm"/>
+    <w:uiPriority w:val="99"/>
+    <w:semiHidden/>
+    <w:rsid w:val="00E170C7"/>
+    <w:rPr>
+      <w:rFonts w:ascii="Arial" w:eastAsia="Times New Roman" w:hAnsi="Arial" w:cs="Arial"/>
+      <w:vanish/>
+      <w:kern w:val="0"/>
+      <w:sz w:val="16"/>
+      <w:szCs w:val="16"/>
+      <w:lang w:val="en-GB" w:eastAsia="en-GB"/>
+      <w14:ligatures w14:val="none"/>
+    </w:rPr>
+  </w:style>
+  <w:style w:type="character" w:styleId="Emphasis">
+    <w:name w:val="Emphasis"/>
+    <w:basedOn w:val="DefaultParagraphFont"/>
+    <w:uiPriority w:val="20"/>
+    <w:qFormat/>
+    <w:rsid w:val="00E170C7"/>
+    <w:rPr>
+      <w:i/>
+      <w:iCs/>
+    </w:rPr>
+  </w:style>
 </w:styles>
 </file>
 

</xml_diff>